<commit_message>
feat: implement Hero component and initialize CV data structures for portfolio site
</commit_message>
<xml_diff>
--- a/CV_Patrick_Gonzaga.docx
+++ b/CV_Patrick_Gonzaga.docx
@@ -7,6 +7,7 @@
         <w:pStyle w:val="NormalWeb"/>
         <w:overflowPunct w:val="0"/>
         <w:spacing w:before="0" w:beforeAutospacing="0" w:after="0" w:afterAutospacing="0"/>
+        <w:ind w:firstLine="180"/>
         <w:rPr>
           <w:rFonts w:ascii="Raleway Light" w:hAnsi="Raleway Light" w:cstheme="minorBidi"/>
           <w:b/>
@@ -201,45 +202,26 @@
           </wp:anchor>
         </w:drawing>
       </w:r>
-    </w:p>
-    <w:p>
-      <w:pPr>
-        <w:pStyle w:val="NormalWeb"/>
-        <w:overflowPunct w:val="0"/>
-        <w:spacing w:before="0" w:beforeAutospacing="0" w:after="0" w:afterAutospacing="0"/>
-        <w:ind w:left="180"/>
-        <w:rPr>
-          <w:rFonts w:ascii="Raleway Light" w:hAnsi="Raleway Light"/>
+      <w:r>
+        <w:rPr>
+          <w:rFonts w:ascii="Raleway Light" w:hAnsi="Raleway Light" w:cstheme="minorBidi"/>
           <w:b/>
           <w:bCs/>
+          <w:noProof/>
+          <w:spacing w:val="60"/>
+          <w:kern w:val="24"/>
           <w:sz w:val="36"/>
           <w:szCs w:val="36"/>
           <w:lang w:val="en-MY"/>
         </w:rPr>
-      </w:pPr>
-      <w:r>
-        <w:rPr>
-          <w:rFonts w:ascii="Raleway Light" w:hAnsi="Raleway Light" w:cstheme="minorBidi"/>
-          <w:b/>
-          <w:bCs/>
-          <w:noProof/>
-          <w:spacing w:val="60"/>
-          <w:kern w:val="24"/>
-          <w:sz w:val="36"/>
-          <w:szCs w:val="36"/>
-          <w:lang w:val="en-MY"/>
-        </w:rPr>
         <w:t>PATRICK  JAMES LEE  GONZAGA</w:t>
       </w:r>
     </w:p>
     <w:p>
       <w:pPr>
-        <w:tabs>
-          <w:tab w:val="left" w:pos="4530"/>
-        </w:tabs>
-        <w:ind w:firstLine="180"/>
-        <w:rPr>
-          <w:rFonts w:ascii="Helvetica" w:hAnsi="Helvetica"/>
+        <w:spacing w:line="240" w:lineRule="auto"/>
+        <w:ind w:left="180"/>
+        <w:rPr>
           <w:noProof/>
           <w:color w:val="0068A7"/>
           <w:spacing w:val="60"/>
@@ -248,7 +230,6 @@
       </w:pPr>
       <w:r>
         <w:rPr>
-          <w:rFonts w:ascii="Helvetica" w:hAnsi="Helvetica"/>
           <w:noProof/>
           <w:color w:val="0068A7"/>
           <w:spacing w:val="60"/>
@@ -257,13 +238,13 @@
         <mc:AlternateContent>
           <mc:Choice Requires="wps">
             <w:drawing>
-              <wp:anchor distT="0" distB="0" distL="114300" distR="114300" simplePos="0" relativeHeight="251664384" behindDoc="0" locked="0" layoutInCell="1" allowOverlap="1" wp14:anchorId="0C4F8682" wp14:editId="4A17D42E">
+              <wp:anchor distT="0" distB="0" distL="114300" distR="114300" simplePos="0" relativeHeight="251664384" behindDoc="0" locked="0" layoutInCell="1" allowOverlap="1" wp14:anchorId="0C4F8682" wp14:editId="0A6F00EE">
                 <wp:simplePos x="0" y="0"/>
                 <wp:positionH relativeFrom="leftMargin">
                   <wp:posOffset>54610</wp:posOffset>
                 </wp:positionH>
                 <wp:positionV relativeFrom="paragraph">
-                  <wp:posOffset>228600</wp:posOffset>
+                  <wp:posOffset>458470</wp:posOffset>
                 </wp:positionV>
                 <wp:extent cx="1774190" cy="495300"/>
                 <wp:effectExtent l="0" t="0" r="0" b="0"/>
@@ -378,7 +359,7 @@
                 <v:stroke joinstyle="miter"/>
                 <v:path gradientshapeok="t" o:connecttype="rect"/>
               </v:shapetype>
-              <v:shape id="ZoneTexte 112" o:spid="_x0000_s1026" type="#_x0000_t202" style="position:absolute;left:0;text-align:left;margin-left:4.3pt;margin-top:18pt;width:139.7pt;height:39pt;z-index:251664384;visibility:visible;mso-wrap-style:square;mso-height-percent:0;mso-wrap-distance-left:9pt;mso-wrap-distance-top:0;mso-wrap-distance-right:9pt;mso-wrap-distance-bottom:0;mso-position-horizontal:absolute;mso-position-horizontal-relative:left-margin-area;mso-position-vertical:absolute;mso-position-vertical-relative:text;mso-height-percent:0;mso-height-relative:margin;v-text-anchor:middle" o:gfxdata="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" filled="f" stroked="f" strokeweight=".25pt">
+              <v:shape id="ZoneTexte 112" o:spid="_x0000_s1026" type="#_x0000_t202" style="position:absolute;left:0;text-align:left;margin-left:4.3pt;margin-top:36.1pt;width:139.7pt;height:39pt;z-index:251664384;visibility:visible;mso-wrap-style:square;mso-height-percent:0;mso-wrap-distance-left:9pt;mso-wrap-distance-top:0;mso-wrap-distance-right:9pt;mso-wrap-distance-bottom:0;mso-position-horizontal:absolute;mso-position-horizontal-relative:left-margin-area;mso-position-vertical:absolute;mso-position-vertical-relative:text;mso-height-percent:0;mso-height-relative:margin;v-text-anchor:middle" o:gfxdata="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" filled="f" stroked="f" strokeweight=".25pt">
                 <v:stroke miterlimit="4"/>
                 <v:textbox inset=".84333mm,.84333mm,.84333mm,.84333mm">
                   <w:txbxContent>
@@ -446,13 +427,76 @@
       </w:r>
       <w:r>
         <w:rPr>
-          <w:rFonts w:ascii="Helvetica" w:hAnsi="Helvetica"/>
+          <w:rFonts w:cs="Tahoma"/>
+          <w:noProof/>
+          <w:spacing w:val="60"/>
+          <w:kern w:val="24"/>
+          <w:sz w:val="20"/>
+          <w:szCs w:val="20"/>
+        </w:rPr>
+        <w:t xml:space="preserve">Email: </w:t>
+      </w:r>
+      <w:hyperlink r:id="rId7" w:history="1">
+        <w:r>
+          <w:rPr>
+            <w:rStyle w:val="Hyperlink"/>
+            <w:rFonts w:cs="Tahoma"/>
+            <w:noProof/>
+            <w:spacing w:val="60"/>
+            <w:kern w:val="24"/>
+            <w:sz w:val="20"/>
+            <w:szCs w:val="20"/>
+            <w:u w:val="none"/>
+          </w:rPr>
+          <w:t>patrickgonzaga@gmail.com</w:t>
+        </w:r>
+      </w:hyperlink>
+      <w:r>
+        <w:rPr>
+          <w:rFonts w:cs="Tahoma"/>
           <w:noProof/>
           <w:color w:val="0068A7"/>
           <w:spacing w:val="60"/>
           <w:kern w:val="24"/>
-        </w:rPr>
-        <w:t>Software Engineer | .NET · Azure · APIs</w:t>
+          <w:sz w:val="20"/>
+          <w:szCs w:val="20"/>
+        </w:rPr>
+        <w:br/>
+      </w:r>
+      <w:r>
+        <w:rPr>
+          <w:rFonts w:cs="Tahoma"/>
+          <w:noProof/>
+          <w:spacing w:val="60"/>
+          <w:kern w:val="24"/>
+          <w:sz w:val="20"/>
+          <w:szCs w:val="20"/>
+        </w:rPr>
+        <w:t>Portfolio:</w:t>
+      </w:r>
+      <w:r>
+        <w:rPr>
+          <w:rFonts w:cs="Tahoma"/>
+          <w:noProof/>
+          <w:color w:val="0068A7"/>
+          <w:spacing w:val="60"/>
+          <w:kern w:val="24"/>
+          <w:sz w:val="20"/>
+          <w:szCs w:val="20"/>
+        </w:rPr>
+        <w:t xml:space="preserve"> </w:t>
+      </w:r>
+      <w:r>
+        <w:rPr>
+          <w:rFonts w:cs="Tahoma"/>
+          <w:noProof/>
+          <w:color w:val="0068A7"/>
+          <w:spacing w:val="60"/>
+          <w:kern w:val="24"/>
+          <w:sz w:val="20"/>
+          <w:szCs w:val="20"/>
+        </w:rPr>
+        <w:t>https://patgonzaga.dev</w:t>
       </w:r>
     </w:p>
     <w:p>
@@ -480,7 +524,7 @@
         <mc:AlternateContent>
           <mc:Choice Requires="wps">
             <w:drawing>
-              <wp:anchor distT="0" distB="0" distL="114300" distR="114300" simplePos="0" relativeHeight="251663360" behindDoc="0" locked="0" layoutInCell="1" allowOverlap="1" wp14:anchorId="38D2FC0E" wp14:editId="034D3EFD">
+              <wp:anchor distT="0" distB="0" distL="114300" distR="114300" simplePos="0" relativeHeight="251663360" behindDoc="0" locked="0" layoutInCell="1" allowOverlap="1" wp14:anchorId="38D2FC0E" wp14:editId="1189156C">
                 <wp:simplePos x="0" y="0"/>
                 <wp:positionH relativeFrom="margin">
                   <wp:align>right</wp:align>
@@ -547,7 +591,7 @@
           </mc:Choice>
           <mc:Fallback>
             <w:pict>
-              <v:line w14:anchorId="76566DAA" id="Connecteur droit 103" o:spid="_x0000_s1026" style="position:absolute;flip:y;z-index:251663360;visibility:visible;mso-wrap-style:square;mso-width-percent:0;mso-height-percent:0;mso-wrap-distance-left:9pt;mso-wrap-distance-top:0;mso-wrap-distance-right:9pt;mso-wrap-distance-bottom:0;mso-position-horizontal:right;mso-position-horizontal-relative:margin;mso-position-vertical:absolute;mso-position-vertical-relative:text;mso-width-percent:0;mso-height-percent:0;mso-width-relative:margin;mso-height-relative:margin" from="341.05pt,2.5pt" to="733.3pt,4.75pt" o:gfxdata="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" strokecolor="#004a77" strokeweight="2.25pt">
+              <v:line w14:anchorId="5764FF11" id="Connecteur droit 103" o:spid="_x0000_s1026" style="position:absolute;flip:y;z-index:251663360;visibility:visible;mso-wrap-style:square;mso-width-percent:0;mso-height-percent:0;mso-wrap-distance-left:9pt;mso-wrap-distance-top:0;mso-wrap-distance-right:9pt;mso-wrap-distance-bottom:0;mso-position-horizontal:right;mso-position-horizontal-relative:margin;mso-position-vertical:absolute;mso-position-vertical-relative:text;mso-width-percent:0;mso-height-percent:0;mso-width-relative:margin;mso-height-relative:margin" from="341.05pt,2.5pt" to="733.3pt,4.75pt" o:gfxdata="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" strokecolor="#004a77" strokeweight="2.25pt">
                 <v:stroke miterlimit="4" joinstyle="miter"/>
                 <o:lock v:ext="edit" shapetype="f"/>
                 <w10:wrap anchorx="margin"/>
@@ -584,51 +628,29 @@
           <w:sz w:val="22"/>
           <w:szCs w:val="22"/>
         </w:rPr>
-        <w:t>Software engineer with 15+ years of experience across backend development, system integration, and enterprise platforms.</w:t>
-      </w:r>
-      <w:r>
-        <w:rPr>
-          <w:rFonts w:asciiTheme="minorHAnsi" w:eastAsia="Calibri" w:hAnsiTheme="minorHAnsi" w:cstheme="minorHAnsi"/>
-          <w:noProof/>
-          <w:color w:val="000000" w:themeColor="text1"/>
-          <w:kern w:val="24"/>
-          <w:sz w:val="22"/>
-          <w:szCs w:val="22"/>
-        </w:rPr>
-        <w:t xml:space="preserve"> </w:t>
-      </w:r>
-      <w:r>
-        <w:rPr>
-          <w:rFonts w:asciiTheme="minorHAnsi" w:eastAsia="Calibri" w:hAnsiTheme="minorHAnsi" w:cstheme="minorHAnsi"/>
-          <w:noProof/>
-          <w:color w:val="000000" w:themeColor="text1"/>
-          <w:kern w:val="24"/>
-          <w:sz w:val="22"/>
-          <w:szCs w:val="22"/>
-        </w:rPr>
-        <w:t>Currently focused on .NET and Azure cloud services, building APIs, integrating distributed systems.</w:t>
-      </w:r>
-      <w:r>
-        <w:rPr>
-          <w:rFonts w:asciiTheme="minorHAnsi" w:eastAsia="Calibri" w:hAnsiTheme="minorHAnsi" w:cstheme="minorHAnsi"/>
-          <w:noProof/>
-          <w:color w:val="000000" w:themeColor="text1"/>
-          <w:kern w:val="24"/>
-          <w:sz w:val="22"/>
-          <w:szCs w:val="22"/>
-        </w:rPr>
-        <w:t xml:space="preserve"> </w:t>
-      </w:r>
-      <w:r>
-        <w:rPr>
-          <w:rFonts w:asciiTheme="minorHAnsi" w:eastAsia="Calibri" w:hAnsiTheme="minorHAnsi" w:cstheme="minorHAnsi"/>
-          <w:noProof/>
-          <w:color w:val="000000" w:themeColor="text1"/>
-          <w:kern w:val="24"/>
-          <w:sz w:val="22"/>
-          <w:szCs w:val="22"/>
-        </w:rPr>
-        <w:t>Proven experience across cloud-based applications, manufacturing execution systems (MES), and SAP integrations, with a strong focus on reliability, scalability, and improving business operations.</w:t>
+        <w:t xml:space="preserve">Software engineer with 15+ years of experience building systems that support real business operations — spanning backend development, system integrations, and enterprise platforms. Currently focused on .NET and Azure, delivering APIs and distributed systems that are stable and maintainable at scale. Known for stepping into unfamiliar technology and delivering — from learning ABAP </w:t>
+      </w:r>
+      <w:r>
+        <w:rPr>
+          <w:rFonts w:asciiTheme="minorHAnsi" w:eastAsia="Calibri" w:hAnsiTheme="minorHAnsi" w:cstheme="minorHAnsi"/>
+          <w:noProof/>
+          <w:color w:val="000000" w:themeColor="text1"/>
+          <w:kern w:val="24"/>
+          <w:sz w:val="22"/>
+          <w:szCs w:val="22"/>
+        </w:rPr>
+        <w:t>to bridge</w:t>
+      </w:r>
+      <w:r>
+        <w:rPr>
+          <w:rFonts w:asciiTheme="minorHAnsi" w:eastAsia="Calibri" w:hAnsiTheme="minorHAnsi" w:cstheme="minorHAnsi"/>
+          <w:noProof/>
+          <w:color w:val="000000" w:themeColor="text1"/>
+          <w:kern w:val="24"/>
+          <w:sz w:val="22"/>
+          <w:szCs w:val="22"/>
+        </w:rPr>
+        <w:t xml:space="preserve"> SAP-to-MES integrations to picking up Retool to build production admin tooling.</w:t>
       </w:r>
     </w:p>
     <w:p>
@@ -662,13 +684,13 @@
         <mc:AlternateContent>
           <mc:Choice Requires="wps">
             <w:drawing>
-              <wp:anchor distT="0" distB="0" distL="114300" distR="114300" simplePos="0" relativeHeight="251677696" behindDoc="0" locked="0" layoutInCell="1" allowOverlap="1" wp14:anchorId="61B3AF97" wp14:editId="3562488D">
+              <wp:anchor distT="0" distB="0" distL="114300" distR="114300" simplePos="0" relativeHeight="251677696" behindDoc="0" locked="0" layoutInCell="1" allowOverlap="1" wp14:anchorId="61B3AF97" wp14:editId="4EBA9DCE">
                 <wp:simplePos x="0" y="0"/>
                 <wp:positionH relativeFrom="page">
-                  <wp:align>left</wp:align>
+                  <wp:posOffset>0</wp:posOffset>
                 </wp:positionH>
                 <wp:positionV relativeFrom="paragraph">
-                  <wp:posOffset>175260</wp:posOffset>
+                  <wp:posOffset>3810</wp:posOffset>
                 </wp:positionV>
                 <wp:extent cx="1774190" cy="495300"/>
                 <wp:effectExtent l="0" t="0" r="0" b="0"/>
@@ -779,7 +801,7 @@
           </mc:Choice>
           <mc:Fallback>
             <w:pict>
-              <v:shape w14:anchorId="61B3AF97" id="_x0000_s1027" type="#_x0000_t202" style="position:absolute;left:0;text-align:left;margin-left:0;margin-top:13.8pt;width:139.7pt;height:39pt;z-index:251677696;visibility:visible;mso-wrap-style:square;mso-height-percent:0;mso-wrap-distance-left:9pt;mso-wrap-distance-top:0;mso-wrap-distance-right:9pt;mso-wrap-distance-bottom:0;mso-position-horizontal:left;mso-position-horizontal-relative:page;mso-position-vertical:absolute;mso-position-vertical-relative:text;mso-height-percent:0;mso-height-relative:margin;v-text-anchor:middle" o:gfxdata="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" filled="f" stroked="f" strokeweight=".25pt">
+              <v:shape w14:anchorId="61B3AF97" id="_x0000_s1027" type="#_x0000_t202" style="position:absolute;left:0;text-align:left;margin-left:0;margin-top:.3pt;width:139.7pt;height:39pt;z-index:251677696;visibility:visible;mso-wrap-style:square;mso-height-percent:0;mso-wrap-distance-left:9pt;mso-wrap-distance-top:0;mso-wrap-distance-right:9pt;mso-wrap-distance-bottom:0;mso-position-horizontal:absolute;mso-position-horizontal-relative:page;mso-position-vertical:absolute;mso-position-vertical-relative:text;mso-height-percent:0;mso-height-relative:margin;v-text-anchor:middle" o:gfxdata="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" filled="f" stroked="f" strokeweight=".25pt">
                 <v:stroke miterlimit="4"/>
                 <v:textbox inset=".84333mm,.84333mm,.84333mm,.84333mm">
                   <w:txbxContent>
@@ -871,7 +893,7 @@
         <mc:AlternateContent>
           <mc:Choice Requires="wps">
             <w:drawing>
-              <wp:anchor distT="0" distB="0" distL="114300" distR="114300" simplePos="0" relativeHeight="251679744" behindDoc="0" locked="0" layoutInCell="1" allowOverlap="1" wp14:anchorId="32C0C4D2" wp14:editId="6DBD4926">
+              <wp:anchor distT="0" distB="0" distL="114300" distR="114300" simplePos="0" relativeHeight="251679744" behindDoc="0" locked="0" layoutInCell="1" allowOverlap="1" wp14:anchorId="32C0C4D2" wp14:editId="2385D58C">
                 <wp:simplePos x="0" y="0"/>
                 <wp:positionH relativeFrom="margin">
                   <wp:align>right</wp:align>
@@ -938,7 +960,7 @@
           </mc:Choice>
           <mc:Fallback>
             <w:pict>
-              <v:line w14:anchorId="632B0BE8" id="Connecteur droit 103" o:spid="_x0000_s1026" style="position:absolute;flip:y;z-index:251679744;visibility:visible;mso-wrap-style:square;mso-width-percent:0;mso-height-percent:0;mso-wrap-distance-left:9pt;mso-wrap-distance-top:0;mso-wrap-distance-right:9pt;mso-wrap-distance-bottom:0;mso-position-horizontal:right;mso-position-horizontal-relative:margin;mso-position-vertical:absolute;mso-position-vertical-relative:text;mso-width-percent:0;mso-height-percent:0;mso-width-relative:margin;mso-height-relative:margin" from="341.05pt,2.25pt" to="733.3pt,4.5pt" o:gfxdata="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" strokecolor="#004a77" strokeweight="2.25pt">
+              <v:line w14:anchorId="355D885B" id="Connecteur droit 103" o:spid="_x0000_s1026" style="position:absolute;flip:y;z-index:251679744;visibility:visible;mso-wrap-style:square;mso-width-percent:0;mso-height-percent:0;mso-wrap-distance-left:9pt;mso-wrap-distance-top:0;mso-wrap-distance-right:9pt;mso-wrap-distance-bottom:0;mso-position-horizontal:right;mso-position-horizontal-relative:margin;mso-position-vertical:absolute;mso-position-vertical-relative:text;mso-width-percent:0;mso-height-percent:0;mso-width-relative:margin;mso-height-relative:margin" from="341.05pt,2.25pt" to="733.3pt,4.5pt" o:gfxdata="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" strokecolor="#004a77" strokeweight="2.25pt">
                 <v:stroke miterlimit="4" joinstyle="miter"/>
                 <o:lock v:ext="edit" shapetype="f"/>
                 <w10:wrap anchorx="margin"/>
@@ -1169,133 +1191,22 @@
       </w:pPr>
       <w:r>
         <w:rPr>
-          <w:rFonts w:eastAsia="Calibri" w:cstheme="minorHAnsi"/>
-          <w:b/>
-          <w:bCs/>
-          <w:noProof/>
-          <w:color w:val="000000" w:themeColor="text1"/>
-          <w:kern w:val="24"/>
-        </w:rPr>
-        <w:t>AI-Assisted Dev:</w:t>
-      </w:r>
-      <w:r>
-        <w:rPr>
-          <w:rFonts w:eastAsia="Calibri" w:cstheme="minorHAnsi"/>
-          <w:noProof/>
-          <w:color w:val="000000" w:themeColor="text1"/>
-          <w:kern w:val="24"/>
-        </w:rPr>
-        <w:t xml:space="preserve"> Cursor</w:t>
-      </w:r>
-      <w:r>
-        <w:rPr>
-          <w:rFonts w:eastAsia="Calibri" w:cstheme="minorHAnsi"/>
-          <w:noProof/>
-          <w:color w:val="000000" w:themeColor="text1"/>
-          <w:kern w:val="24"/>
-        </w:rPr>
-        <w:t>.</w:t>
-      </w:r>
-    </w:p>
-    <w:p>
-      <w:pPr>
-        <w:pStyle w:val="ListParagraph"/>
-        <w:numPr>
-          <w:ilvl w:val="0"/>
-          <w:numId w:val="1"/>
-        </w:numPr>
-        <w:spacing w:after="0" w:line="240" w:lineRule="auto"/>
-        <w:jc w:val="both"/>
-        <w:rPr>
-          <w:rFonts w:eastAsia="Calibri" w:cstheme="minorHAnsi"/>
-          <w:noProof/>
-          <w:color w:val="000000" w:themeColor="text1"/>
-          <w:kern w:val="24"/>
-        </w:rPr>
-      </w:pPr>
-      <w:r>
-        <w:rPr>
-          <w:rFonts w:eastAsia="Calibri" w:cstheme="minorHAnsi"/>
-          <w:b/>
-          <w:bCs/>
-          <w:noProof/>
-          <w:color w:val="000000" w:themeColor="text1"/>
-          <w:kern w:val="24"/>
-        </w:rPr>
-        <w:t>Portal &amp; Reporting:</w:t>
-      </w:r>
-      <w:r>
-        <w:rPr>
-          <w:rFonts w:eastAsia="Calibri" w:cstheme="minorHAnsi"/>
-          <w:noProof/>
-          <w:color w:val="000000" w:themeColor="text1"/>
-          <w:kern w:val="24"/>
-        </w:rPr>
-        <w:t xml:space="preserve"> Retool, TIBCO Spotfire</w:t>
-      </w:r>
-      <w:r>
-        <w:rPr>
-          <w:rFonts w:eastAsia="Calibri" w:cstheme="minorHAnsi"/>
-          <w:noProof/>
-          <w:color w:val="000000" w:themeColor="text1"/>
-          <w:kern w:val="24"/>
-        </w:rPr>
-        <w:t>.</w:t>
-      </w:r>
-    </w:p>
-    <w:p>
-      <w:pPr>
-        <w:pStyle w:val="ListParagraph"/>
-        <w:spacing w:after="0" w:line="240" w:lineRule="auto"/>
-        <w:jc w:val="both"/>
-        <w:rPr>
-          <w:rFonts w:eastAsia="Calibri" w:cstheme="minorHAnsi"/>
-          <w:noProof/>
-          <w:color w:val="000000" w:themeColor="text1"/>
-          <w:kern w:val="24"/>
-        </w:rPr>
-      </w:pPr>
-    </w:p>
-    <w:p>
-      <w:pPr>
-        <w:pStyle w:val="NormalWeb"/>
-        <w:tabs>
-          <w:tab w:val="right" w:pos="7088"/>
-        </w:tabs>
-        <w:spacing w:before="0" w:beforeAutospacing="0" w:after="0" w:afterAutospacing="0"/>
-        <w:ind w:left="90"/>
-        <w:jc w:val="both"/>
-        <w:rPr>
-          <w:rFonts w:ascii="Calibri" w:eastAsia="Calibri" w:hAnsi="Calibri" w:cs="Calibri"/>
-          <w:b/>
-          <w:bCs/>
-          <w:noProof/>
-          <w:color w:val="0086D8"/>
-          <w:kern w:val="24"/>
-          <w:sz w:val="22"/>
-          <w:szCs w:val="22"/>
-        </w:rPr>
-      </w:pPr>
-      <w:r>
-        <w:rPr>
-          <w:rFonts w:ascii="Helvetica" w:hAnsi="Helvetica" w:cstheme="minorBidi"/>
+          <w:rFonts w:ascii="Helvetica" w:hAnsi="Helvetica"/>
           <w:noProof/>
           <w:color w:val="0068A7"/>
           <w:spacing w:val="60"/>
           <w:kern w:val="24"/>
-          <w:sz w:val="22"/>
-          <w:szCs w:val="22"/>
         </w:rPr>
         <mc:AlternateContent>
           <mc:Choice Requires="wps">
             <w:drawing>
-              <wp:anchor distT="0" distB="0" distL="114300" distR="114300" simplePos="0" relativeHeight="251667456" behindDoc="0" locked="0" layoutInCell="1" allowOverlap="1" wp14:anchorId="11883FBB" wp14:editId="28F92039">
+              <wp:anchor distT="0" distB="0" distL="114300" distR="114300" simplePos="0" relativeHeight="251667456" behindDoc="0" locked="0" layoutInCell="1" allowOverlap="1" wp14:anchorId="11883FBB" wp14:editId="567B2EAE">
                 <wp:simplePos x="0" y="0"/>
                 <wp:positionH relativeFrom="page">
-                  <wp:align>left</wp:align>
+                  <wp:posOffset>0</wp:posOffset>
                 </wp:positionH>
                 <wp:positionV relativeFrom="paragraph">
-                  <wp:posOffset>15875</wp:posOffset>
+                  <wp:posOffset>356235</wp:posOffset>
                 </wp:positionV>
                 <wp:extent cx="1774190" cy="561975"/>
                 <wp:effectExtent l="0" t="0" r="0" b="9525"/>
@@ -1377,7 +1288,7 @@
           </mc:Choice>
           <mc:Fallback>
             <w:pict>
-              <v:shape w14:anchorId="11883FBB" id="_x0000_s1028" type="#_x0000_t202" style="position:absolute;left:0;text-align:left;margin-left:0;margin-top:1.25pt;width:139.7pt;height:44.25pt;z-index:251667456;visibility:visible;mso-wrap-style:square;mso-height-percent:0;mso-wrap-distance-left:9pt;mso-wrap-distance-top:0;mso-wrap-distance-right:9pt;mso-wrap-distance-bottom:0;mso-position-horizontal:left;mso-position-horizontal-relative:page;mso-position-vertical:absolute;mso-position-vertical-relative:text;mso-height-percent:0;mso-height-relative:margin;v-text-anchor:middle" o:gfxdata="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" filled="f" stroked="f" strokeweight=".25pt">
+              <v:shape w14:anchorId="11883FBB" id="_x0000_s1028" type="#_x0000_t202" style="position:absolute;left:0;text-align:left;margin-left:0;margin-top:28.05pt;width:139.7pt;height:44.25pt;z-index:251667456;visibility:visible;mso-wrap-style:square;mso-height-percent:0;mso-wrap-distance-left:9pt;mso-wrap-distance-top:0;mso-wrap-distance-right:9pt;mso-wrap-distance-bottom:0;mso-position-horizontal:absolute;mso-position-horizontal-relative:page;mso-position-vertical:absolute;mso-position-vertical-relative:text;mso-height-percent:0;mso-height-relative:margin;v-text-anchor:middle" o:gfxdata="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" filled="f" stroked="f" strokeweight=".25pt">
                 <v:stroke miterlimit="4"/>
                 <v:textbox inset=".84333mm,.84333mm,.84333mm,.84333mm">
                   <w:txbxContent>
@@ -1416,12 +1327,121 @@
       </w:r>
       <w:r>
         <w:rPr>
+          <w:rFonts w:eastAsia="Calibri" w:cstheme="minorHAnsi"/>
+          <w:b/>
+          <w:bCs/>
+          <w:noProof/>
+          <w:color w:val="000000" w:themeColor="text1"/>
+          <w:kern w:val="24"/>
+        </w:rPr>
+        <w:t>AI-Assisted Dev:</w:t>
+      </w:r>
+      <w:r>
+        <w:rPr>
+          <w:rFonts w:eastAsia="Calibri" w:cstheme="minorHAnsi"/>
+          <w:noProof/>
+          <w:color w:val="000000" w:themeColor="text1"/>
+          <w:kern w:val="24"/>
+        </w:rPr>
+        <w:t xml:space="preserve"> Cursor</w:t>
+      </w:r>
+      <w:r>
+        <w:rPr>
+          <w:rFonts w:eastAsia="Calibri" w:cstheme="minorHAnsi"/>
+          <w:noProof/>
+          <w:color w:val="000000" w:themeColor="text1"/>
+          <w:kern w:val="24"/>
+        </w:rPr>
+        <w:t>.</w:t>
+      </w:r>
+    </w:p>
+    <w:p>
+      <w:pPr>
+        <w:pStyle w:val="ListParagraph"/>
+        <w:numPr>
+          <w:ilvl w:val="0"/>
+          <w:numId w:val="1"/>
+        </w:numPr>
+        <w:spacing w:after="0" w:line="240" w:lineRule="auto"/>
+        <w:jc w:val="both"/>
+        <w:rPr>
+          <w:rFonts w:eastAsia="Calibri" w:cstheme="minorHAnsi"/>
+          <w:noProof/>
+          <w:color w:val="000000" w:themeColor="text1"/>
+          <w:kern w:val="24"/>
+        </w:rPr>
+      </w:pPr>
+      <w:r>
+        <w:rPr>
+          <w:rFonts w:eastAsia="Calibri" w:cstheme="minorHAnsi"/>
+          <w:b/>
+          <w:bCs/>
+          <w:noProof/>
+          <w:color w:val="000000" w:themeColor="text1"/>
+          <w:kern w:val="24"/>
+        </w:rPr>
+        <w:t>Portal &amp; Reporting:</w:t>
+      </w:r>
+      <w:r>
+        <w:rPr>
+          <w:rFonts w:eastAsia="Calibri" w:cstheme="minorHAnsi"/>
+          <w:noProof/>
+          <w:color w:val="000000" w:themeColor="text1"/>
+          <w:kern w:val="24"/>
+        </w:rPr>
+        <w:t xml:space="preserve"> Retool, TIBCO Spotfire</w:t>
+      </w:r>
+      <w:r>
+        <w:rPr>
+          <w:rFonts w:eastAsia="Calibri" w:cstheme="minorHAnsi"/>
+          <w:noProof/>
+          <w:color w:val="000000" w:themeColor="text1"/>
+          <w:kern w:val="24"/>
+        </w:rPr>
+        <w:t>.</w:t>
+      </w:r>
+    </w:p>
+    <w:p>
+      <w:pPr>
+        <w:pStyle w:val="ListParagraph"/>
+        <w:spacing w:after="0" w:line="240" w:lineRule="auto"/>
+        <w:jc w:val="both"/>
+        <w:rPr>
+          <w:rFonts w:eastAsia="Calibri" w:cstheme="minorHAnsi"/>
+          <w:noProof/>
+          <w:color w:val="000000" w:themeColor="text1"/>
+          <w:kern w:val="24"/>
+        </w:rPr>
+      </w:pPr>
+    </w:p>
+    <w:p>
+      <w:pPr>
+        <w:pStyle w:val="NormalWeb"/>
+        <w:tabs>
+          <w:tab w:val="right" w:pos="7088"/>
+        </w:tabs>
+        <w:spacing w:before="0" w:beforeAutospacing="0" w:after="0" w:afterAutospacing="0"/>
+        <w:ind w:left="90"/>
+        <w:jc w:val="both"/>
+        <w:rPr>
+          <w:rFonts w:ascii="Calibri" w:eastAsia="Calibri" w:hAnsi="Calibri" w:cs="Calibri"/>
+          <w:b/>
+          <w:bCs/>
+          <w:noProof/>
+          <w:color w:val="0086D8"/>
+          <w:kern w:val="24"/>
+          <w:sz w:val="22"/>
+          <w:szCs w:val="22"/>
+        </w:rPr>
+      </w:pPr>
+      <w:r>
+        <w:rPr>
           <w:noProof/>
         </w:rPr>
         <mc:AlternateContent>
           <mc:Choice Requires="wps">
             <w:drawing>
-              <wp:anchor distT="0" distB="0" distL="114300" distR="114300" simplePos="0" relativeHeight="251666432" behindDoc="0" locked="0" layoutInCell="1" allowOverlap="1" wp14:anchorId="13C9A1E9" wp14:editId="01F5A345">
+              <wp:anchor distT="0" distB="0" distL="114300" distR="114300" simplePos="0" relativeHeight="251666432" behindDoc="0" locked="0" layoutInCell="1" allowOverlap="1" wp14:anchorId="13C9A1E9" wp14:editId="0A7706DA">
                 <wp:simplePos x="0" y="0"/>
                 <wp:positionH relativeFrom="margin">
                   <wp:align>right</wp:align>
@@ -1488,7 +1508,7 @@
           </mc:Choice>
           <mc:Fallback>
             <w:pict>
-              <v:line w14:anchorId="69FD08DB" id="Connecteur droit 103" o:spid="_x0000_s1026" style="position:absolute;z-index:251666432;visibility:visible;mso-wrap-style:square;mso-width-percent:0;mso-height-percent:0;mso-wrap-distance-left:9pt;mso-wrap-distance-top:0;mso-wrap-distance-right:9pt;mso-wrap-distance-bottom:0;mso-position-horizontal:right;mso-position-horizontal-relative:margin;mso-position-vertical:absolute;mso-position-vertical-relative:text;mso-width-percent:0;mso-height-percent:0;mso-width-relative:margin;mso-height-relative:margin" from="338.05pt,6.8pt" to="727.3pt,6.8pt" o:gfxdata="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" strokecolor="#004a77" strokeweight="2.25pt">
+              <v:line w14:anchorId="69DDB3B8" id="Connecteur droit 103" o:spid="_x0000_s1026" style="position:absolute;z-index:251666432;visibility:visible;mso-wrap-style:square;mso-width-percent:0;mso-height-percent:0;mso-wrap-distance-left:9pt;mso-wrap-distance-top:0;mso-wrap-distance-right:9pt;mso-wrap-distance-bottom:0;mso-position-horizontal:right;mso-position-horizontal-relative:margin;mso-position-vertical:absolute;mso-position-vertical-relative:text;mso-width-percent:0;mso-height-percent:0;mso-width-relative:margin;mso-height-relative:margin" from="338.05pt,6.8pt" to="727.3pt,6.8pt" o:gfxdata="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" strokecolor="#004a77" strokeweight="2.25pt">
                 <v:stroke miterlimit="4" joinstyle="miter"/>
                 <o:lock v:ext="edit" shapetype="f"/>
                 <w10:wrap anchorx="margin"/>
@@ -1710,9 +1730,25 @@
           <w:sz w:val="22"/>
           <w:szCs w:val="22"/>
         </w:rPr>
-        <w:t>Client: Discovery Holiday Parks (</w:t>
-      </w:r>
-      <w:hyperlink r:id="rId7" w:history="1">
+        <w:t xml:space="preserve">Client: Discovery Holiday Parks </w:t>
+      </w:r>
+    </w:p>
+    <w:p>
+      <w:pPr>
+        <w:pStyle w:val="NormalWeb"/>
+        <w:spacing w:before="0" w:beforeAutospacing="0" w:after="0" w:afterAutospacing="0"/>
+        <w:ind w:left="180"/>
+        <w:jc w:val="both"/>
+        <w:rPr>
+          <w:rFonts w:asciiTheme="minorHAnsi" w:eastAsia="Calibri" w:hAnsiTheme="minorHAnsi" w:cstheme="minorHAnsi"/>
+          <w:noProof/>
+          <w:color w:val="000000" w:themeColor="text1"/>
+          <w:kern w:val="24"/>
+          <w:sz w:val="22"/>
+          <w:szCs w:val="22"/>
+        </w:rPr>
+      </w:pPr>
+      <w:hyperlink r:id="rId8" w:history="1">
         <w:r>
           <w:rPr>
             <w:rStyle w:val="Hyperlink"/>
@@ -1722,7 +1758,29 @@
             <w:sz w:val="22"/>
             <w:szCs w:val="22"/>
           </w:rPr>
-          <w:t>https://www.discoveryholidayparks.com.au</w:t>
+          <w:t>https://www.discoveryholida</w:t>
+        </w:r>
+        <w:r>
+          <w:rPr>
+            <w:rStyle w:val="Hyperlink"/>
+            <w:rFonts w:asciiTheme="minorHAnsi" w:eastAsia="Calibri" w:hAnsiTheme="minorHAnsi" w:cstheme="minorHAnsi"/>
+            <w:noProof/>
+            <w:kern w:val="24"/>
+            <w:sz w:val="22"/>
+            <w:szCs w:val="22"/>
+          </w:rPr>
+          <w:t>y</w:t>
+        </w:r>
+        <w:r>
+          <w:rPr>
+            <w:rStyle w:val="Hyperlink"/>
+            <w:rFonts w:asciiTheme="minorHAnsi" w:eastAsia="Calibri" w:hAnsiTheme="minorHAnsi" w:cstheme="minorHAnsi"/>
+            <w:noProof/>
+            <w:kern w:val="24"/>
+            <w:sz w:val="22"/>
+            <w:szCs w:val="22"/>
+          </w:rPr>
+          <w:t>parks.com.au</w:t>
         </w:r>
       </w:hyperlink>
       <w:r>
@@ -1736,7 +1794,7 @@
         </w:rPr>
         <w:t xml:space="preserve"> &amp; </w:t>
       </w:r>
-      <w:hyperlink r:id="rId8" w:history="1">
+      <w:hyperlink r:id="rId9" w:history="1">
         <w:r>
           <w:rPr>
             <w:rStyle w:val="Hyperlink"/>
@@ -1749,41 +1807,6 @@
           <w:t>https://www.wikicamps.com.au</w:t>
         </w:r>
       </w:hyperlink>
-      <w:r>
-        <w:rPr>
-          <w:rFonts w:asciiTheme="minorHAnsi" w:eastAsia="Calibri" w:hAnsiTheme="minorHAnsi" w:cstheme="minorHAnsi"/>
-          <w:noProof/>
-          <w:color w:val="000000" w:themeColor="text1"/>
-          <w:kern w:val="24"/>
-          <w:sz w:val="22"/>
-          <w:szCs w:val="22"/>
-        </w:rPr>
-        <w:t>)</w:t>
-      </w:r>
-      <w:r>
-        <w:rPr>
-          <w:rFonts w:asciiTheme="minorHAnsi" w:eastAsia="Calibri" w:hAnsiTheme="minorHAnsi" w:cstheme="minorHAnsi"/>
-          <w:noProof/>
-          <w:color w:val="000000" w:themeColor="text1"/>
-          <w:kern w:val="24"/>
-          <w:sz w:val="22"/>
-          <w:szCs w:val="22"/>
-        </w:rPr>
-        <w:t xml:space="preserve"> </w:t>
-      </w:r>
-      <w:r>
-        <w:rPr>
-          <w:rFonts w:asciiTheme="minorHAnsi" w:eastAsia="Calibri" w:hAnsiTheme="minorHAnsi" w:cstheme="minorHAnsi"/>
-          <w:b/>
-          <w:bCs/>
-          <w:noProof/>
-          <w:color w:val="000000" w:themeColor="text1"/>
-          <w:kern w:val="24"/>
-          <w:sz w:val="22"/>
-          <w:szCs w:val="22"/>
-        </w:rPr>
-        <w:t xml:space="preserve"> </w:t>
-      </w:r>
     </w:p>
     <w:p>
       <w:pPr>
@@ -2094,9 +2117,25 @@
           <w:sz w:val="22"/>
           <w:szCs w:val="22"/>
         </w:rPr>
-        <w:t>Client: Optima Technology AU  (</w:t>
-      </w:r>
-      <w:hyperlink r:id="rId9" w:history="1">
+        <w:t xml:space="preserve">Client: Optima Technology AU  </w:t>
+      </w:r>
+    </w:p>
+    <w:p>
+      <w:pPr>
+        <w:pStyle w:val="NormalWeb"/>
+        <w:spacing w:before="0" w:beforeAutospacing="0" w:after="0" w:afterAutospacing="0"/>
+        <w:ind w:firstLine="180"/>
+        <w:jc w:val="both"/>
+        <w:rPr>
+          <w:rFonts w:asciiTheme="minorHAnsi" w:eastAsia="Calibri" w:hAnsiTheme="minorHAnsi" w:cstheme="minorHAnsi"/>
+          <w:noProof/>
+          <w:color w:val="000000" w:themeColor="text1"/>
+          <w:kern w:val="24"/>
+          <w:sz w:val="22"/>
+          <w:szCs w:val="22"/>
+        </w:rPr>
+      </w:pPr>
+      <w:hyperlink r:id="rId10" w:history="1">
         <w:r>
           <w:rPr>
             <w:rStyle w:val="Hyperlink"/>
@@ -2106,20 +2145,31 @@
             <w:sz w:val="22"/>
             <w:szCs w:val="22"/>
           </w:rPr>
-          <w:t>https://www.optimatech.io</w:t>
+          <w:t>https://www.opti</w:t>
+        </w:r>
+        <w:r>
+          <w:rPr>
+            <w:rStyle w:val="Hyperlink"/>
+            <w:rFonts w:asciiTheme="minorHAnsi" w:eastAsia="Calibri" w:hAnsiTheme="minorHAnsi" w:cstheme="minorHAnsi"/>
+            <w:noProof/>
+            <w:kern w:val="24"/>
+            <w:sz w:val="22"/>
+            <w:szCs w:val="22"/>
+          </w:rPr>
+          <w:t>m</w:t>
+        </w:r>
+        <w:r>
+          <w:rPr>
+            <w:rStyle w:val="Hyperlink"/>
+            <w:rFonts w:asciiTheme="minorHAnsi" w:eastAsia="Calibri" w:hAnsiTheme="minorHAnsi" w:cstheme="minorHAnsi"/>
+            <w:noProof/>
+            <w:kern w:val="24"/>
+            <w:sz w:val="22"/>
+            <w:szCs w:val="22"/>
+          </w:rPr>
+          <w:t>atech.io</w:t>
         </w:r>
       </w:hyperlink>
-      <w:r>
-        <w:rPr>
-          <w:rFonts w:asciiTheme="minorHAnsi" w:eastAsia="Calibri" w:hAnsiTheme="minorHAnsi" w:cstheme="minorHAnsi"/>
-          <w:noProof/>
-          <w:color w:val="000000" w:themeColor="text1"/>
-          <w:kern w:val="24"/>
-          <w:sz w:val="22"/>
-          <w:szCs w:val="22"/>
-        </w:rPr>
-        <w:t>)</w:t>
-      </w:r>
     </w:p>
     <w:p>
       <w:pPr>
@@ -3602,7 +3652,88 @@
           <w:color w:val="000000" w:themeColor="text1"/>
           <w:kern w:val="24"/>
         </w:rPr>
-        <w:t xml:space="preserve">Azure Bicep, Docker, Secure Code Reviews (2025) • Azure DevOps CI/CD, AWS &amp; Cloud Computing, Python Foundations (2024) • AWS Cloud Essentials, S3 Deep Dive (2022) • Data Engineering, Data Science &amp; Machine Learning (Project SPARTA, 2022) </w:t>
+        <w:t>Learn Infra as a Code with Azure Bicep</w:t>
+      </w:r>
+      <w:r>
+        <w:rPr>
+          <w:rFonts w:eastAsia="Calibri" w:cstheme="minorHAnsi"/>
+          <w:noProof/>
+          <w:color w:val="000000" w:themeColor="text1"/>
+          <w:kern w:val="24"/>
+        </w:rPr>
+        <w:t xml:space="preserve"> </w:t>
+      </w:r>
+      <w:r>
+        <w:rPr>
+          <w:rFonts w:eastAsia="Calibri" w:cstheme="minorHAnsi"/>
+          <w:noProof/>
+          <w:color w:val="000000" w:themeColor="text1"/>
+          <w:kern w:val="24"/>
+        </w:rPr>
+        <w:t xml:space="preserve">(2025) • </w:t>
+      </w:r>
+      <w:r>
+        <w:rPr>
+          <w:rFonts w:eastAsia="Calibri" w:cstheme="minorHAnsi"/>
+          <w:noProof/>
+          <w:color w:val="000000" w:themeColor="text1"/>
+          <w:kern w:val="24"/>
+        </w:rPr>
+        <w:t>Learn Azure DevOps CI/CD pipelines</w:t>
+      </w:r>
+      <w:r>
+        <w:rPr>
+          <w:rFonts w:eastAsia="Calibri" w:cstheme="minorHAnsi"/>
+          <w:noProof/>
+          <w:color w:val="000000" w:themeColor="text1"/>
+          <w:kern w:val="24"/>
+        </w:rPr>
+        <w:t xml:space="preserve"> </w:t>
+      </w:r>
+      <w:r>
+        <w:rPr>
+          <w:rFonts w:eastAsia="Calibri" w:cstheme="minorHAnsi"/>
+          <w:noProof/>
+          <w:color w:val="000000" w:themeColor="text1"/>
+          <w:kern w:val="24"/>
+        </w:rPr>
+        <w:t>(202</w:t>
+      </w:r>
+      <w:r>
+        <w:rPr>
+          <w:rFonts w:eastAsia="Calibri" w:cstheme="minorHAnsi"/>
+          <w:noProof/>
+          <w:color w:val="000000" w:themeColor="text1"/>
+          <w:kern w:val="24"/>
+        </w:rPr>
+        <w:t>5</w:t>
+      </w:r>
+      <w:r>
+        <w:rPr>
+          <w:rFonts w:eastAsia="Calibri" w:cstheme="minorHAnsi"/>
+          <w:noProof/>
+          <w:color w:val="000000" w:themeColor="text1"/>
+          <w:kern w:val="24"/>
+        </w:rPr>
+        <w:t xml:space="preserve">) • </w:t>
+      </w:r>
+      <w:r>
+        <w:rPr>
+          <w:rFonts w:eastAsia="Calibri" w:cstheme="minorHAnsi"/>
+          <w:noProof/>
+          <w:color w:val="000000" w:themeColor="text1"/>
+          <w:kern w:val="24"/>
+        </w:rPr>
+        <w:t>Code Reviews for Secure, Clean, and Scalable Code</w:t>
+      </w:r>
+      <w:r>
+        <w:rPr>
+          <w:rFonts w:eastAsia="Calibri" w:cstheme="minorHAnsi"/>
+          <w:noProof/>
+          <w:color w:val="000000" w:themeColor="text1"/>
+          <w:kern w:val="24"/>
+        </w:rPr>
+        <w:t xml:space="preserve"> (2024) • Data Engineering, Data Science &amp; Machine Learning (Project SPARTA, 2022) </w:t>
       </w:r>
     </w:p>
     <w:p>
@@ -5853,6 +5984,18 @@
       <w:shd w:val="clear" w:color="auto" w:fill="E1DFDD"/>
     </w:rPr>
   </w:style>
+  <w:style w:type="character" w:styleId="FollowedHyperlink">
+    <w:name w:val="FollowedHyperlink"/>
+    <w:basedOn w:val="DefaultParagraphFont"/>
+    <w:uiPriority w:val="99"/>
+    <w:semiHidden/>
+    <w:unhideWhenUsed/>
+    <w:rsid w:val="00463E35"/>
+    <w:rPr>
+      <w:color w:val="96607D" w:themeColor="followedHyperlink"/>
+      <w:u w:val="single"/>
+    </w:rPr>
+  </w:style>
 </w:styles>
 </file>
 

</xml_diff>

<commit_message>
docs: update professional experience and skills in CV_Patrick_Gonzaga.docx
</commit_message>
<xml_diff>
--- a/CV_Patrick_Gonzaga.docx
+++ b/CV_Patrick_Gonzaga.docx
@@ -352,7 +352,7 @@
               </wp:anchor>
             </w:drawing>
           </mc:Choice>
-          <mc:Fallback xmlns:oel="http://schemas.microsoft.com/office/2019/extlst" xmlns:w16du="http://schemas.microsoft.com/office/word/2023/wordml/word16du" xmlns:w16sdtfl="http://schemas.microsoft.com/office/word/2024/wordml/sdtformatlock">
+          <mc:Fallback xmlns:w16sdtfl="http://schemas.microsoft.com/office/word/2024/wordml/sdtformatlock" xmlns:w16du="http://schemas.microsoft.com/office/word/2023/wordml/word16du" xmlns:oel="http://schemas.microsoft.com/office/2019/extlst">
             <w:pict>
               <v:shapetype w14:anchorId="0C4F8682" id="_x0000_t202" coordsize="21600,21600" o:spt="202" path="m,l,21600r21600,l21600,xe">
                 <v:stroke joinstyle="miter"/>
@@ -607,7 +607,7 @@
               </wp:anchor>
             </w:drawing>
           </mc:Choice>
-          <mc:Fallback xmlns:oel="http://schemas.microsoft.com/office/2019/extlst" xmlns:w16du="http://schemas.microsoft.com/office/word/2023/wordml/word16du" xmlns:w16sdtfl="http://schemas.microsoft.com/office/word/2024/wordml/sdtformatlock">
+          <mc:Fallback xmlns:w16sdtfl="http://schemas.microsoft.com/office/word/2024/wordml/sdtformatlock" xmlns:w16du="http://schemas.microsoft.com/office/word/2023/wordml/word16du" xmlns:oel="http://schemas.microsoft.com/office/2019/extlst">
             <w:pict>
               <v:line w14:anchorId="5764FF11" id="Connecteur droit 103" o:spid="_x0000_s1026" style="position:absolute;flip:y;z-index:251663360;visibility:visible;mso-wrap-style:square;mso-width-percent:0;mso-height-percent:0;mso-wrap-distance-left:9pt;mso-wrap-distance-top:0;mso-wrap-distance-right:9pt;mso-wrap-distance-bottom:0;mso-position-horizontal:right;mso-position-horizontal-relative:margin;mso-position-vertical:absolute;mso-position-vertical-relative:text;mso-width-percent:0;mso-height-percent:0;mso-width-relative:margin;mso-height-relative:margin" from="341.05pt,2.5pt" to="733.3pt,4.75pt" o:gfxdata="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" strokecolor="#004a77" strokeweight="2.25pt">
                 <v:stroke miterlimit="4" joinstyle="miter"/>
@@ -817,7 +817,7 @@
               </wp:anchor>
             </w:drawing>
           </mc:Choice>
-          <mc:Fallback xmlns:oel="http://schemas.microsoft.com/office/2019/extlst" xmlns:w16du="http://schemas.microsoft.com/office/word/2023/wordml/word16du" xmlns:w16sdtfl="http://schemas.microsoft.com/office/word/2024/wordml/sdtformatlock">
+          <mc:Fallback xmlns:w16sdtfl="http://schemas.microsoft.com/office/word/2024/wordml/sdtformatlock" xmlns:w16du="http://schemas.microsoft.com/office/word/2023/wordml/word16du" xmlns:oel="http://schemas.microsoft.com/office/2019/extlst">
             <w:pict>
               <v:shape w14:anchorId="61B3AF97" id="_x0000_s1027" type="#_x0000_t202" style="position:absolute;left:0;text-align:left;margin-left:0;margin-top:.3pt;width:139.7pt;height:39pt;z-index:251677696;visibility:visible;mso-wrap-style:square;mso-height-percent:0;mso-wrap-distance-left:9pt;mso-wrap-distance-top:0;mso-wrap-distance-right:9pt;mso-wrap-distance-bottom:0;mso-position-horizontal:absolute;mso-position-horizontal-relative:page;mso-position-vertical:absolute;mso-position-vertical-relative:text;mso-height-percent:0;mso-height-relative:margin;v-text-anchor:middle" o:gfxdata="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" filled="f" stroked="f" strokeweight=".25pt">
                 <v:stroke miterlimit="4"/>
@@ -976,7 +976,7 @@
               </wp:anchor>
             </w:drawing>
           </mc:Choice>
-          <mc:Fallback xmlns:oel="http://schemas.microsoft.com/office/2019/extlst" xmlns:w16du="http://schemas.microsoft.com/office/word/2023/wordml/word16du" xmlns:w16sdtfl="http://schemas.microsoft.com/office/word/2024/wordml/sdtformatlock">
+          <mc:Fallback xmlns:w16sdtfl="http://schemas.microsoft.com/office/word/2024/wordml/sdtformatlock" xmlns:w16du="http://schemas.microsoft.com/office/word/2023/wordml/word16du" xmlns:oel="http://schemas.microsoft.com/office/2019/extlst">
             <w:pict>
               <v:line w14:anchorId="355D885B" id="Connecteur droit 103" o:spid="_x0000_s1026" style="position:absolute;flip:y;z-index:251679744;visibility:visible;mso-wrap-style:square;mso-width-percent:0;mso-height-percent:0;mso-wrap-distance-left:9pt;mso-wrap-distance-top:0;mso-wrap-distance-right:9pt;mso-wrap-distance-bottom:0;mso-position-horizontal:right;mso-position-horizontal-relative:margin;mso-position-vertical:absolute;mso-position-vertical-relative:text;mso-width-percent:0;mso-height-percent:0;mso-width-relative:margin;mso-height-relative:margin" from="341.05pt,2.25pt" to="733.3pt,4.5pt" o:gfxdata="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" strokecolor="#004a77" strokeweight="2.25pt">
                 <v:stroke miterlimit="4" joinstyle="miter"/>
@@ -1304,7 +1304,7 @@
               </wp:anchor>
             </w:drawing>
           </mc:Choice>
-          <mc:Fallback xmlns:oel="http://schemas.microsoft.com/office/2019/extlst" xmlns:w16du="http://schemas.microsoft.com/office/word/2023/wordml/word16du" xmlns:w16sdtfl="http://schemas.microsoft.com/office/word/2024/wordml/sdtformatlock">
+          <mc:Fallback xmlns:w16sdtfl="http://schemas.microsoft.com/office/word/2024/wordml/sdtformatlock" xmlns:w16du="http://schemas.microsoft.com/office/word/2023/wordml/word16du" xmlns:oel="http://schemas.microsoft.com/office/2019/extlst">
             <w:pict>
               <v:shape w14:anchorId="11883FBB" id="_x0000_s1028" type="#_x0000_t202" style="position:absolute;left:0;text-align:left;margin-left:0;margin-top:28.05pt;width:139.7pt;height:44.25pt;z-index:251667456;visibility:visible;mso-wrap-style:square;mso-height-percent:0;mso-wrap-distance-left:9pt;mso-wrap-distance-top:0;mso-wrap-distance-right:9pt;mso-wrap-distance-bottom:0;mso-position-horizontal:absolute;mso-position-horizontal-relative:page;mso-position-vertical:absolute;mso-position-vertical-relative:text;mso-height-percent:0;mso-height-relative:margin;v-text-anchor:middle" o:gfxdata="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" filled="f" stroked="f" strokeweight=".25pt">
                 <v:stroke miterlimit="4"/>
@@ -1524,7 +1524,7 @@
               </wp:anchor>
             </w:drawing>
           </mc:Choice>
-          <mc:Fallback xmlns:oel="http://schemas.microsoft.com/office/2019/extlst" xmlns:w16du="http://schemas.microsoft.com/office/word/2023/wordml/word16du" xmlns:w16sdtfl="http://schemas.microsoft.com/office/word/2024/wordml/sdtformatlock">
+          <mc:Fallback xmlns:w16sdtfl="http://schemas.microsoft.com/office/word/2024/wordml/sdtformatlock" xmlns:w16du="http://schemas.microsoft.com/office/word/2023/wordml/word16du" xmlns:oel="http://schemas.microsoft.com/office/2019/extlst">
             <w:pict>
               <v:line w14:anchorId="69DDB3B8" id="Connecteur droit 103" o:spid="_x0000_s1026" style="position:absolute;z-index:251666432;visibility:visible;mso-wrap-style:square;mso-width-percent:0;mso-height-percent:0;mso-wrap-distance-left:9pt;mso-wrap-distance-top:0;mso-wrap-distance-right:9pt;mso-wrap-distance-bottom:0;mso-position-horizontal:right;mso-position-horizontal-relative:margin;mso-position-vertical:absolute;mso-position-vertical-relative:text;mso-width-percent:0;mso-height-percent:0;mso-width-relative:margin;mso-height-relative:margin" from="338.05pt,6.8pt" to="727.3pt,6.8pt" o:gfxdata="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" strokecolor="#004a77" strokeweight="2.25pt">
                 <v:stroke miterlimit="4" joinstyle="miter"/>
@@ -3437,7 +3437,7 @@
               </wp:anchor>
             </w:drawing>
           </mc:Choice>
-          <mc:Fallback xmlns:oel="http://schemas.microsoft.com/office/2019/extlst" xmlns:w16du="http://schemas.microsoft.com/office/word/2023/wordml/word16du" xmlns:w16sdtfl="http://schemas.microsoft.com/office/word/2024/wordml/sdtformatlock">
+          <mc:Fallback xmlns:w16sdtfl="http://schemas.microsoft.com/office/word/2024/wordml/sdtformatlock" xmlns:w16du="http://schemas.microsoft.com/office/word/2023/wordml/word16du" xmlns:oel="http://schemas.microsoft.com/office/2019/extlst">
             <w:pict>
               <v:shape w14:anchorId="4AB30922" id="_x0000_s1029" type="#_x0000_t202" style="position:absolute;left:0;text-align:left;margin-left:88.5pt;margin-top:.75pt;width:139.7pt;height:44.25pt;z-index:251673600;visibility:visible;mso-wrap-style:square;mso-height-percent:0;mso-wrap-distance-left:9pt;mso-wrap-distance-top:0;mso-wrap-distance-right:9pt;mso-wrap-distance-bottom:0;mso-position-horizontal:right;mso-position-horizontal-relative:left-margin-area;mso-position-vertical:absolute;mso-position-vertical-relative:text;mso-height-percent:0;mso-height-relative:margin;v-text-anchor:middle" o:gfxdata="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" filled="f" stroked="f" strokeweight=".25pt">
                 <v:stroke miterlimit="4"/>
@@ -3550,7 +3550,7 @@
               </wp:anchor>
             </w:drawing>
           </mc:Choice>
-          <mc:Fallback xmlns:oel="http://schemas.microsoft.com/office/2019/extlst" xmlns:w16du="http://schemas.microsoft.com/office/word/2023/wordml/word16du" xmlns:w16sdtfl="http://schemas.microsoft.com/office/word/2024/wordml/sdtformatlock">
+          <mc:Fallback xmlns:w16sdtfl="http://schemas.microsoft.com/office/word/2024/wordml/sdtformatlock" xmlns:w16du="http://schemas.microsoft.com/office/word/2023/wordml/word16du" xmlns:oel="http://schemas.microsoft.com/office/2019/extlst">
             <w:pict>
               <v:line w14:anchorId="2EF59E94" id="Connecteur droit 103" o:spid="_x0000_s1026" style="position:absolute;flip:y;z-index:251675648;visibility:visible;mso-wrap-style:square;mso-width-percent:0;mso-height-percent:0;mso-wrap-distance-left:9pt;mso-wrap-distance-top:0;mso-wrap-distance-right:9pt;mso-wrap-distance-bottom:0;mso-position-horizontal:right;mso-position-horizontal-relative:margin;mso-position-vertical:absolute;mso-position-vertical-relative:text;mso-width-percent:0;mso-height-percent:0;mso-width-relative:margin;mso-height-relative:margin" from="341.05pt,6.75pt" to="733.3pt,9pt" o:gfxdata="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" strokecolor="#004a77" strokeweight="2.25pt">
                 <v:stroke miterlimit="4" joinstyle="miter"/>
@@ -3582,6 +3582,42 @@
           <w:kern w:val="24"/>
         </w:rPr>
         <w:t>N8N Masterclass: Learn Basic AI &amp; Automation using N8N</w:t>
+      </w:r>
+      <w:r>
+        <w:rPr>
+          <w:rFonts w:eastAsia="Calibri" w:cstheme="minorHAnsi"/>
+          <w:noProof/>
+          <w:color w:val="000000" w:themeColor="text1"/>
+          <w:kern w:val="24"/>
+        </w:rPr>
+        <w:t xml:space="preserve"> (2026) </w:t>
+      </w:r>
+      <w:r>
+        <w:rPr>
+          <w:rFonts w:eastAsia="Calibri" w:cstheme="minorHAnsi"/>
+          <w:noProof/>
+          <w:color w:val="000000" w:themeColor="text1"/>
+          <w:kern w:val="24"/>
+        </w:rPr>
+        <w:t>•</w:t>
+      </w:r>
+      <w:r>
+        <w:rPr>
+          <w:rFonts w:eastAsia="Calibri" w:cstheme="minorHAnsi"/>
+          <w:noProof/>
+          <w:color w:val="000000" w:themeColor="text1"/>
+          <w:kern w:val="24"/>
+        </w:rPr>
+        <w:t xml:space="preserve"> </w:t>
+      </w:r>
+      <w:r>
+        <w:rPr>
+          <w:rFonts w:eastAsia="Calibri" w:cstheme="minorHAnsi"/>
+          <w:noProof/>
+          <w:color w:val="000000" w:themeColor="text1"/>
+          <w:kern w:val="24"/>
+        </w:rPr>
+        <w:t>The Complete ReactJs Course - Basics to Advanced</w:t>
       </w:r>
       <w:r>
         <w:rPr>
@@ -3877,7 +3913,7 @@
               </wp:anchor>
             </w:drawing>
           </mc:Choice>
-          <mc:Fallback xmlns:oel="http://schemas.microsoft.com/office/2019/extlst" xmlns:w16du="http://schemas.microsoft.com/office/word/2023/wordml/word16du" xmlns:w16sdtfl="http://schemas.microsoft.com/office/word/2024/wordml/sdtformatlock">
+          <mc:Fallback xmlns:w16sdtfl="http://schemas.microsoft.com/office/word/2024/wordml/sdtformatlock" xmlns:w16du="http://schemas.microsoft.com/office/word/2023/wordml/word16du" xmlns:oel="http://schemas.microsoft.com/office/2019/extlst">
             <w:pict>
               <v:shape w14:anchorId="4871004E" id="_x0000_s1030" type="#_x0000_t202" style="position:absolute;left:0;text-align:left;margin-left:88.5pt;margin-top:1.05pt;width:139.7pt;height:44.25pt;z-index:251685888;visibility:visible;mso-wrap-style:square;mso-height-percent:0;mso-wrap-distance-left:9pt;mso-wrap-distance-top:0;mso-wrap-distance-right:9pt;mso-wrap-distance-bottom:0;mso-position-horizontal:right;mso-position-horizontal-relative:left-margin-area;mso-position-vertical:absolute;mso-position-vertical-relative:text;mso-height-percent:0;mso-height-relative:margin;v-text-anchor:middle" o:gfxdata="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" filled="f" stroked="f" strokeweight=".25pt">
                 <v:stroke miterlimit="4"/>
@@ -3990,7 +4026,7 @@
               </wp:anchor>
             </w:drawing>
           </mc:Choice>
-          <mc:Fallback xmlns:oel="http://schemas.microsoft.com/office/2019/extlst" xmlns:w16du="http://schemas.microsoft.com/office/word/2023/wordml/word16du" xmlns:w16sdtfl="http://schemas.microsoft.com/office/word/2024/wordml/sdtformatlock">
+          <mc:Fallback xmlns:w16sdtfl="http://schemas.microsoft.com/office/word/2024/wordml/sdtformatlock" xmlns:w16du="http://schemas.microsoft.com/office/word/2023/wordml/word16du" xmlns:oel="http://schemas.microsoft.com/office/2019/extlst">
             <w:pict>
               <v:line w14:anchorId="51701AEA" id="Connecteur droit 103" o:spid="_x0000_s1026" style="position:absolute;flip:y;z-index:251683840;visibility:visible;mso-wrap-style:square;mso-width-percent:0;mso-height-percent:0;mso-wrap-distance-left:9pt;mso-wrap-distance-top:0;mso-wrap-distance-right:9pt;mso-wrap-distance-bottom:0;mso-position-horizontal:right;mso-position-horizontal-relative:margin;mso-position-vertical:absolute;mso-position-vertical-relative:text;mso-width-percent:0;mso-height-percent:0;mso-width-relative:margin;mso-height-relative:margin" from="341.05pt,3.75pt" to="733.3pt,6pt" o:gfxdata="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" strokecolor="#004a77" strokeweight="2.25pt">
                 <v:stroke miterlimit="4" joinstyle="miter"/>

</xml_diff>

<commit_message>
docs: update resume content in CV_Patrick_Gonzaga.docx
</commit_message>
<xml_diff>
--- a/CV_Patrick_Gonzaga.docx
+++ b/CV_Patrick_Gonzaga.docx
@@ -352,7 +352,7 @@
               </wp:anchor>
             </w:drawing>
           </mc:Choice>
-          <mc:Fallback xmlns:w16sdtfl="http://schemas.microsoft.com/office/word/2024/wordml/sdtformatlock" xmlns:w16du="http://schemas.microsoft.com/office/word/2023/wordml/word16du" xmlns:oel="http://schemas.microsoft.com/office/2019/extlst">
+          <mc:Fallback xmlns:oel="http://schemas.microsoft.com/office/2019/extlst" xmlns:w16du="http://schemas.microsoft.com/office/word/2023/wordml/word16du" xmlns:w16sdtfl="http://schemas.microsoft.com/office/word/2024/wordml/sdtformatlock">
             <w:pict>
               <v:shapetype w14:anchorId="0C4F8682" id="_x0000_t202" coordsize="21600,21600" o:spt="202" path="m,l,21600r21600,l21600,xe">
                 <v:stroke joinstyle="miter"/>
@@ -607,7 +607,7 @@
               </wp:anchor>
             </w:drawing>
           </mc:Choice>
-          <mc:Fallback xmlns:w16sdtfl="http://schemas.microsoft.com/office/word/2024/wordml/sdtformatlock" xmlns:w16du="http://schemas.microsoft.com/office/word/2023/wordml/word16du" xmlns:oel="http://schemas.microsoft.com/office/2019/extlst">
+          <mc:Fallback xmlns:oel="http://schemas.microsoft.com/office/2019/extlst" xmlns:w16du="http://schemas.microsoft.com/office/word/2023/wordml/word16du" xmlns:w16sdtfl="http://schemas.microsoft.com/office/word/2024/wordml/sdtformatlock">
             <w:pict>
               <v:line w14:anchorId="5764FF11" id="Connecteur droit 103" o:spid="_x0000_s1026" style="position:absolute;flip:y;z-index:251663360;visibility:visible;mso-wrap-style:square;mso-width-percent:0;mso-height-percent:0;mso-wrap-distance-left:9pt;mso-wrap-distance-top:0;mso-wrap-distance-right:9pt;mso-wrap-distance-bottom:0;mso-position-horizontal:right;mso-position-horizontal-relative:margin;mso-position-vertical:absolute;mso-position-vertical-relative:text;mso-width-percent:0;mso-height-percent:0;mso-width-relative:margin;mso-height-relative:margin" from="341.05pt,2.5pt" to="733.3pt,4.75pt" o:gfxdata="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" strokecolor="#004a77" strokeweight="2.25pt">
                 <v:stroke miterlimit="4" joinstyle="miter"/>
@@ -817,7 +817,7 @@
               </wp:anchor>
             </w:drawing>
           </mc:Choice>
-          <mc:Fallback xmlns:w16sdtfl="http://schemas.microsoft.com/office/word/2024/wordml/sdtformatlock" xmlns:w16du="http://schemas.microsoft.com/office/word/2023/wordml/word16du" xmlns:oel="http://schemas.microsoft.com/office/2019/extlst">
+          <mc:Fallback xmlns:oel="http://schemas.microsoft.com/office/2019/extlst" xmlns:w16du="http://schemas.microsoft.com/office/word/2023/wordml/word16du" xmlns:w16sdtfl="http://schemas.microsoft.com/office/word/2024/wordml/sdtformatlock">
             <w:pict>
               <v:shape w14:anchorId="61B3AF97" id="_x0000_s1027" type="#_x0000_t202" style="position:absolute;left:0;text-align:left;margin-left:0;margin-top:.3pt;width:139.7pt;height:39pt;z-index:251677696;visibility:visible;mso-wrap-style:square;mso-height-percent:0;mso-wrap-distance-left:9pt;mso-wrap-distance-top:0;mso-wrap-distance-right:9pt;mso-wrap-distance-bottom:0;mso-position-horizontal:absolute;mso-position-horizontal-relative:page;mso-position-vertical:absolute;mso-position-vertical-relative:text;mso-height-percent:0;mso-height-relative:margin;v-text-anchor:middle" o:gfxdata="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" filled="f" stroked="f" strokeweight=".25pt">
                 <v:stroke miterlimit="4"/>
@@ -976,7 +976,7 @@
               </wp:anchor>
             </w:drawing>
           </mc:Choice>
-          <mc:Fallback xmlns:w16sdtfl="http://schemas.microsoft.com/office/word/2024/wordml/sdtformatlock" xmlns:w16du="http://schemas.microsoft.com/office/word/2023/wordml/word16du" xmlns:oel="http://schemas.microsoft.com/office/2019/extlst">
+          <mc:Fallback xmlns:oel="http://schemas.microsoft.com/office/2019/extlst" xmlns:w16du="http://schemas.microsoft.com/office/word/2023/wordml/word16du" xmlns:w16sdtfl="http://schemas.microsoft.com/office/word/2024/wordml/sdtformatlock">
             <w:pict>
               <v:line w14:anchorId="355D885B" id="Connecteur droit 103" o:spid="_x0000_s1026" style="position:absolute;flip:y;z-index:251679744;visibility:visible;mso-wrap-style:square;mso-width-percent:0;mso-height-percent:0;mso-wrap-distance-left:9pt;mso-wrap-distance-top:0;mso-wrap-distance-right:9pt;mso-wrap-distance-bottom:0;mso-position-horizontal:right;mso-position-horizontal-relative:margin;mso-position-vertical:absolute;mso-position-vertical-relative:text;mso-width-percent:0;mso-height-percent:0;mso-width-relative:margin;mso-height-relative:margin" from="341.05pt,2.25pt" to="733.3pt,4.5pt" o:gfxdata="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" strokecolor="#004a77" strokeweight="2.25pt">
                 <v:stroke miterlimit="4" joinstyle="miter"/>
@@ -1304,7 +1304,7 @@
               </wp:anchor>
             </w:drawing>
           </mc:Choice>
-          <mc:Fallback xmlns:w16sdtfl="http://schemas.microsoft.com/office/word/2024/wordml/sdtformatlock" xmlns:w16du="http://schemas.microsoft.com/office/word/2023/wordml/word16du" xmlns:oel="http://schemas.microsoft.com/office/2019/extlst">
+          <mc:Fallback xmlns:oel="http://schemas.microsoft.com/office/2019/extlst" xmlns:w16du="http://schemas.microsoft.com/office/word/2023/wordml/word16du" xmlns:w16sdtfl="http://schemas.microsoft.com/office/word/2024/wordml/sdtformatlock">
             <w:pict>
               <v:shape w14:anchorId="11883FBB" id="_x0000_s1028" type="#_x0000_t202" style="position:absolute;left:0;text-align:left;margin-left:0;margin-top:28.05pt;width:139.7pt;height:44.25pt;z-index:251667456;visibility:visible;mso-wrap-style:square;mso-height-percent:0;mso-wrap-distance-left:9pt;mso-wrap-distance-top:0;mso-wrap-distance-right:9pt;mso-wrap-distance-bottom:0;mso-position-horizontal:absolute;mso-position-horizontal-relative:page;mso-position-vertical:absolute;mso-position-vertical-relative:text;mso-height-percent:0;mso-height-relative:margin;v-text-anchor:middle" o:gfxdata="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" filled="f" stroked="f" strokeweight=".25pt">
                 <v:stroke miterlimit="4"/>
@@ -1524,7 +1524,7 @@
               </wp:anchor>
             </w:drawing>
           </mc:Choice>
-          <mc:Fallback xmlns:w16sdtfl="http://schemas.microsoft.com/office/word/2024/wordml/sdtformatlock" xmlns:w16du="http://schemas.microsoft.com/office/word/2023/wordml/word16du" xmlns:oel="http://schemas.microsoft.com/office/2019/extlst">
+          <mc:Fallback xmlns:oel="http://schemas.microsoft.com/office/2019/extlst" xmlns:w16du="http://schemas.microsoft.com/office/word/2023/wordml/word16du" xmlns:w16sdtfl="http://schemas.microsoft.com/office/word/2024/wordml/sdtformatlock">
             <w:pict>
               <v:line w14:anchorId="69DDB3B8" id="Connecteur droit 103" o:spid="_x0000_s1026" style="position:absolute;z-index:251666432;visibility:visible;mso-wrap-style:square;mso-width-percent:0;mso-height-percent:0;mso-wrap-distance-left:9pt;mso-wrap-distance-top:0;mso-wrap-distance-right:9pt;mso-wrap-distance-bottom:0;mso-position-horizontal:right;mso-position-horizontal-relative:margin;mso-position-vertical:absolute;mso-position-vertical-relative:text;mso-width-percent:0;mso-height-percent:0;mso-width-relative:margin;mso-height-relative:margin" from="338.05pt,6.8pt" to="727.3pt,6.8pt" o:gfxdata="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" strokecolor="#004a77" strokeweight="2.25pt">
                 <v:stroke miterlimit="4" joinstyle="miter"/>
@@ -3437,7 +3437,7 @@
               </wp:anchor>
             </w:drawing>
           </mc:Choice>
-          <mc:Fallback xmlns:w16sdtfl="http://schemas.microsoft.com/office/word/2024/wordml/sdtformatlock" xmlns:w16du="http://schemas.microsoft.com/office/word/2023/wordml/word16du" xmlns:oel="http://schemas.microsoft.com/office/2019/extlst">
+          <mc:Fallback xmlns:oel="http://schemas.microsoft.com/office/2019/extlst" xmlns:w16du="http://schemas.microsoft.com/office/word/2023/wordml/word16du" xmlns:w16sdtfl="http://schemas.microsoft.com/office/word/2024/wordml/sdtformatlock">
             <w:pict>
               <v:shape w14:anchorId="4AB30922" id="_x0000_s1029" type="#_x0000_t202" style="position:absolute;left:0;text-align:left;margin-left:88.5pt;margin-top:.75pt;width:139.7pt;height:44.25pt;z-index:251673600;visibility:visible;mso-wrap-style:square;mso-height-percent:0;mso-wrap-distance-left:9pt;mso-wrap-distance-top:0;mso-wrap-distance-right:9pt;mso-wrap-distance-bottom:0;mso-position-horizontal:right;mso-position-horizontal-relative:left-margin-area;mso-position-vertical:absolute;mso-position-vertical-relative:text;mso-height-percent:0;mso-height-relative:margin;v-text-anchor:middle" o:gfxdata="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" filled="f" stroked="f" strokeweight=".25pt">
                 <v:stroke miterlimit="4"/>
@@ -3550,7 +3550,7 @@
               </wp:anchor>
             </w:drawing>
           </mc:Choice>
-          <mc:Fallback xmlns:w16sdtfl="http://schemas.microsoft.com/office/word/2024/wordml/sdtformatlock" xmlns:w16du="http://schemas.microsoft.com/office/word/2023/wordml/word16du" xmlns:oel="http://schemas.microsoft.com/office/2019/extlst">
+          <mc:Fallback xmlns:oel="http://schemas.microsoft.com/office/2019/extlst" xmlns:w16du="http://schemas.microsoft.com/office/word/2023/wordml/word16du" xmlns:w16sdtfl="http://schemas.microsoft.com/office/word/2024/wordml/sdtformatlock">
             <w:pict>
               <v:line w14:anchorId="2EF59E94" id="Connecteur droit 103" o:spid="_x0000_s1026" style="position:absolute;flip:y;z-index:251675648;visibility:visible;mso-wrap-style:square;mso-width-percent:0;mso-height-percent:0;mso-wrap-distance-left:9pt;mso-wrap-distance-top:0;mso-wrap-distance-right:9pt;mso-wrap-distance-bottom:0;mso-position-horizontal:right;mso-position-horizontal-relative:margin;mso-position-vertical:absolute;mso-position-vertical-relative:text;mso-width-percent:0;mso-height-percent:0;mso-width-relative:margin;mso-height-relative:margin" from="341.05pt,6.75pt" to="733.3pt,9pt" o:gfxdata="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" strokecolor="#004a77" strokeweight="2.25pt">
                 <v:stroke miterlimit="4" joinstyle="miter"/>
@@ -3913,7 +3913,7 @@
               </wp:anchor>
             </w:drawing>
           </mc:Choice>
-          <mc:Fallback xmlns:w16sdtfl="http://schemas.microsoft.com/office/word/2024/wordml/sdtformatlock" xmlns:w16du="http://schemas.microsoft.com/office/word/2023/wordml/word16du" xmlns:oel="http://schemas.microsoft.com/office/2019/extlst">
+          <mc:Fallback xmlns:oel="http://schemas.microsoft.com/office/2019/extlst" xmlns:w16du="http://schemas.microsoft.com/office/word/2023/wordml/word16du" xmlns:w16sdtfl="http://schemas.microsoft.com/office/word/2024/wordml/sdtformatlock">
             <w:pict>
               <v:shape w14:anchorId="4871004E" id="_x0000_s1030" type="#_x0000_t202" style="position:absolute;left:0;text-align:left;margin-left:88.5pt;margin-top:1.05pt;width:139.7pt;height:44.25pt;z-index:251685888;visibility:visible;mso-wrap-style:square;mso-height-percent:0;mso-wrap-distance-left:9pt;mso-wrap-distance-top:0;mso-wrap-distance-right:9pt;mso-wrap-distance-bottom:0;mso-position-horizontal:right;mso-position-horizontal-relative:left-margin-area;mso-position-vertical:absolute;mso-position-vertical-relative:text;mso-height-percent:0;mso-height-relative:margin;v-text-anchor:middle" o:gfxdata="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" filled="f" stroked="f" strokeweight=".25pt">
                 <v:stroke miterlimit="4"/>
@@ -4026,7 +4026,7 @@
               </wp:anchor>
             </w:drawing>
           </mc:Choice>
-          <mc:Fallback xmlns:w16sdtfl="http://schemas.microsoft.com/office/word/2024/wordml/sdtformatlock" xmlns:w16du="http://schemas.microsoft.com/office/word/2023/wordml/word16du" xmlns:oel="http://schemas.microsoft.com/office/2019/extlst">
+          <mc:Fallback xmlns:oel="http://schemas.microsoft.com/office/2019/extlst" xmlns:w16du="http://schemas.microsoft.com/office/word/2023/wordml/word16du" xmlns:w16sdtfl="http://schemas.microsoft.com/office/word/2024/wordml/sdtformatlock">
             <w:pict>
               <v:line w14:anchorId="51701AEA" id="Connecteur droit 103" o:spid="_x0000_s1026" style="position:absolute;flip:y;z-index:251683840;visibility:visible;mso-wrap-style:square;mso-width-percent:0;mso-height-percent:0;mso-wrap-distance-left:9pt;mso-wrap-distance-top:0;mso-wrap-distance-right:9pt;mso-wrap-distance-bottom:0;mso-position-horizontal:right;mso-position-horizontal-relative:margin;mso-position-vertical:absolute;mso-position-vertical-relative:text;mso-width-percent:0;mso-height-percent:0;mso-width-relative:margin;mso-height-relative:margin" from="341.05pt,3.75pt" to="733.3pt,6pt" o:gfxdata="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" strokecolor="#004a77" strokeweight="2.25pt">
                 <v:stroke miterlimit="4" joinstyle="miter"/>
@@ -4163,7 +4163,16 @@
           <w:color w:val="000000" w:themeColor="text1"/>
           <w:kern w:val="24"/>
         </w:rPr>
-        <w:t>Two-time Champion in “INTO PROGRAMMING” Tagisan ng Talino (Regional and National Level) .</w:t>
+        <w:t>Two-time Champion in “INTO PROGRAMMING” Tagisan ng Talino (Regional and National Level)</w:t>
+      </w:r>
+      <w:r>
+        <w:rPr>
+          <w:rFonts w:eastAsia="Calibri" w:cstheme="minorHAnsi"/>
+          <w:noProof/>
+          <w:color w:val="000000" w:themeColor="text1"/>
+          <w:kern w:val="24"/>
+        </w:rPr>
+        <w:t>.</w:t>
       </w:r>
     </w:p>
     <w:p>

</xml_diff>

<commit_message>
feat: Expertise and Exp updates
</commit_message>
<xml_diff>
--- a/CV_Patrick_Gonzaga.docx
+++ b/CV_Patrick_Gonzaga.docx
@@ -352,7 +352,7 @@
               </wp:anchor>
             </w:drawing>
           </mc:Choice>
-          <mc:Fallback xmlns:oel="http://schemas.microsoft.com/office/2019/extlst" xmlns:w16du="http://schemas.microsoft.com/office/word/2023/wordml/word16du" xmlns:w16sdtfl="http://schemas.microsoft.com/office/word/2024/wordml/sdtformatlock">
+          <mc:Fallback xmlns:w16sdtfl="http://schemas.microsoft.com/office/word/2024/wordml/sdtformatlock" xmlns:w16du="http://schemas.microsoft.com/office/word/2023/wordml/word16du" xmlns:oel="http://schemas.microsoft.com/office/2019/extlst">
             <w:pict>
               <v:shapetype w14:anchorId="0C4F8682" id="_x0000_t202" coordsize="21600,21600" o:spt="202" path="m,l,21600r21600,l21600,xe">
                 <v:stroke joinstyle="miter"/>
@@ -607,7 +607,7 @@
               </wp:anchor>
             </w:drawing>
           </mc:Choice>
-          <mc:Fallback xmlns:oel="http://schemas.microsoft.com/office/2019/extlst" xmlns:w16du="http://schemas.microsoft.com/office/word/2023/wordml/word16du" xmlns:w16sdtfl="http://schemas.microsoft.com/office/word/2024/wordml/sdtformatlock">
+          <mc:Fallback xmlns:w16sdtfl="http://schemas.microsoft.com/office/word/2024/wordml/sdtformatlock" xmlns:w16du="http://schemas.microsoft.com/office/word/2023/wordml/word16du" xmlns:oel="http://schemas.microsoft.com/office/2019/extlst">
             <w:pict>
               <v:line w14:anchorId="5764FF11" id="Connecteur droit 103" o:spid="_x0000_s1026" style="position:absolute;flip:y;z-index:251663360;visibility:visible;mso-wrap-style:square;mso-width-percent:0;mso-height-percent:0;mso-wrap-distance-left:9pt;mso-wrap-distance-top:0;mso-wrap-distance-right:9pt;mso-wrap-distance-bottom:0;mso-position-horizontal:right;mso-position-horizontal-relative:margin;mso-position-vertical:absolute;mso-position-vertical-relative:text;mso-width-percent:0;mso-height-percent:0;mso-width-relative:margin;mso-height-relative:margin" from="341.05pt,2.5pt" to="733.3pt,4.75pt" o:gfxdata="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" strokecolor="#004a77" strokeweight="2.25pt">
                 <v:stroke miterlimit="4" joinstyle="miter"/>
@@ -637,6 +637,17 @@
           <w:szCs w:val="22"/>
         </w:rPr>
       </w:pPr>
+      <w:r>
+        <w:rPr>
+          <w:rFonts w:asciiTheme="minorHAnsi" w:eastAsia="Calibri" w:hAnsiTheme="minorHAnsi" w:cstheme="minorHAnsi"/>
+          <w:noProof/>
+          <w:color w:val="000000" w:themeColor="text1"/>
+          <w:kern w:val="24"/>
+          <w:sz w:val="22"/>
+          <w:szCs w:val="22"/>
+        </w:rPr>
+        <w:t xml:space="preserve">Senior </w:t>
+      </w:r>
       <w:r>
         <w:rPr>
           <w:rFonts w:asciiTheme="minorHAnsi" w:eastAsia="Calibri" w:hAnsiTheme="minorHAnsi" w:cstheme="minorHAnsi"/>
@@ -817,7 +828,7 @@
               </wp:anchor>
             </w:drawing>
           </mc:Choice>
-          <mc:Fallback xmlns:oel="http://schemas.microsoft.com/office/2019/extlst" xmlns:w16du="http://schemas.microsoft.com/office/word/2023/wordml/word16du" xmlns:w16sdtfl="http://schemas.microsoft.com/office/word/2024/wordml/sdtformatlock">
+          <mc:Fallback xmlns:w16sdtfl="http://schemas.microsoft.com/office/word/2024/wordml/sdtformatlock" xmlns:w16du="http://schemas.microsoft.com/office/word/2023/wordml/word16du" xmlns:oel="http://schemas.microsoft.com/office/2019/extlst">
             <w:pict>
               <v:shape w14:anchorId="61B3AF97" id="_x0000_s1027" type="#_x0000_t202" style="position:absolute;left:0;text-align:left;margin-left:0;margin-top:.3pt;width:139.7pt;height:39pt;z-index:251677696;visibility:visible;mso-wrap-style:square;mso-height-percent:0;mso-wrap-distance-left:9pt;mso-wrap-distance-top:0;mso-wrap-distance-right:9pt;mso-wrap-distance-bottom:0;mso-position-horizontal:absolute;mso-position-horizontal-relative:page;mso-position-vertical:absolute;mso-position-vertical-relative:text;mso-height-percent:0;mso-height-relative:margin;v-text-anchor:middle" o:gfxdata="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" filled="f" stroked="f" strokeweight=".25pt">
                 <v:stroke miterlimit="4"/>
@@ -976,7 +987,7 @@
               </wp:anchor>
             </w:drawing>
           </mc:Choice>
-          <mc:Fallback xmlns:oel="http://schemas.microsoft.com/office/2019/extlst" xmlns:w16du="http://schemas.microsoft.com/office/word/2023/wordml/word16du" xmlns:w16sdtfl="http://schemas.microsoft.com/office/word/2024/wordml/sdtformatlock">
+          <mc:Fallback xmlns:w16sdtfl="http://schemas.microsoft.com/office/word/2024/wordml/sdtformatlock" xmlns:w16du="http://schemas.microsoft.com/office/word/2023/wordml/word16du" xmlns:oel="http://schemas.microsoft.com/office/2019/extlst">
             <w:pict>
               <v:line w14:anchorId="355D885B" id="Connecteur droit 103" o:spid="_x0000_s1026" style="position:absolute;flip:y;z-index:251679744;visibility:visible;mso-wrap-style:square;mso-width-percent:0;mso-height-percent:0;mso-wrap-distance-left:9pt;mso-wrap-distance-top:0;mso-wrap-distance-right:9pt;mso-wrap-distance-bottom:0;mso-position-horizontal:right;mso-position-horizontal-relative:margin;mso-position-vertical:absolute;mso-position-vertical-relative:text;mso-width-percent:0;mso-height-percent:0;mso-width-relative:margin;mso-height-relative:margin" from="341.05pt,2.25pt" to="733.3pt,4.5pt" o:gfxdata="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" strokecolor="#004a77" strokeweight="2.25pt">
                 <v:stroke miterlimit="4" joinstyle="miter"/>
@@ -1188,7 +1199,133 @@
           <w:color w:val="000000" w:themeColor="text1"/>
           <w:kern w:val="24"/>
         </w:rPr>
-        <w:t xml:space="preserve"> SAP (MM, BOM, Routing, PP, CO), SAP–MES integration</w:t>
+        <w:t xml:space="preserve"> SAP (M</w:t>
+      </w:r>
+      <w:r>
+        <w:rPr>
+          <w:rFonts w:eastAsia="Calibri" w:cstheme="minorHAnsi"/>
+          <w:noProof/>
+          <w:color w:val="000000" w:themeColor="text1"/>
+          <w:kern w:val="24"/>
+        </w:rPr>
+        <w:t xml:space="preserve">aterial </w:t>
+      </w:r>
+      <w:r>
+        <w:rPr>
+          <w:rFonts w:eastAsia="Calibri" w:cstheme="minorHAnsi"/>
+          <w:noProof/>
+          <w:color w:val="000000" w:themeColor="text1"/>
+          <w:kern w:val="24"/>
+        </w:rPr>
+        <w:t>M</w:t>
+      </w:r>
+      <w:r>
+        <w:rPr>
+          <w:rFonts w:eastAsia="Calibri" w:cstheme="minorHAnsi"/>
+          <w:noProof/>
+          <w:color w:val="000000" w:themeColor="text1"/>
+          <w:kern w:val="24"/>
+        </w:rPr>
+        <w:t>anagement</w:t>
+      </w:r>
+      <w:r>
+        <w:rPr>
+          <w:rFonts w:eastAsia="Calibri" w:cstheme="minorHAnsi"/>
+          <w:noProof/>
+          <w:color w:val="000000" w:themeColor="text1"/>
+          <w:kern w:val="24"/>
+        </w:rPr>
+        <w:t xml:space="preserve"> MM</w:t>
+      </w:r>
+      <w:r>
+        <w:rPr>
+          <w:rFonts w:eastAsia="Calibri" w:cstheme="minorHAnsi"/>
+          <w:noProof/>
+          <w:color w:val="000000" w:themeColor="text1"/>
+          <w:kern w:val="24"/>
+        </w:rPr>
+        <w:t>, P</w:t>
+      </w:r>
+      <w:r>
+        <w:rPr>
+          <w:rFonts w:eastAsia="Calibri" w:cstheme="minorHAnsi"/>
+          <w:noProof/>
+          <w:color w:val="000000" w:themeColor="text1"/>
+          <w:kern w:val="24"/>
+        </w:rPr>
+        <w:t xml:space="preserve">roduction </w:t>
+      </w:r>
+      <w:r>
+        <w:rPr>
+          <w:rFonts w:eastAsia="Calibri" w:cstheme="minorHAnsi"/>
+          <w:noProof/>
+          <w:color w:val="000000" w:themeColor="text1"/>
+          <w:kern w:val="24"/>
+        </w:rPr>
+        <w:t>P</w:t>
+      </w:r>
+      <w:r>
+        <w:rPr>
+          <w:rFonts w:eastAsia="Calibri" w:cstheme="minorHAnsi"/>
+          <w:noProof/>
+          <w:color w:val="000000" w:themeColor="text1"/>
+          <w:kern w:val="24"/>
+        </w:rPr>
+        <w:t>lanning</w:t>
+      </w:r>
+      <w:r>
+        <w:rPr>
+          <w:rFonts w:eastAsia="Calibri" w:cstheme="minorHAnsi"/>
+          <w:noProof/>
+          <w:color w:val="000000" w:themeColor="text1"/>
+          <w:kern w:val="24"/>
+        </w:rPr>
+        <w:t xml:space="preserve"> PP</w:t>
+      </w:r>
+      <w:r>
+        <w:rPr>
+          <w:rFonts w:eastAsia="Calibri" w:cstheme="minorHAnsi"/>
+          <w:noProof/>
+          <w:color w:val="000000" w:themeColor="text1"/>
+          <w:kern w:val="24"/>
+        </w:rPr>
+        <w:t>, C</w:t>
+      </w:r>
+      <w:r>
+        <w:rPr>
+          <w:rFonts w:eastAsia="Calibri" w:cstheme="minorHAnsi"/>
+          <w:noProof/>
+          <w:color w:val="000000" w:themeColor="text1"/>
+          <w:kern w:val="24"/>
+        </w:rPr>
+        <w:t>ontrolling</w:t>
+      </w:r>
+      <w:r>
+        <w:rPr>
+          <w:rFonts w:eastAsia="Calibri" w:cstheme="minorHAnsi"/>
+          <w:noProof/>
+          <w:color w:val="000000" w:themeColor="text1"/>
+          <w:kern w:val="24"/>
+        </w:rPr>
+        <w:t xml:space="preserve"> CO</w:t>
+      </w:r>
+      <w:r>
+        <w:rPr>
+          <w:rFonts w:eastAsia="Calibri" w:cstheme="minorHAnsi"/>
+          <w:noProof/>
+          <w:color w:val="000000" w:themeColor="text1"/>
+          <w:kern w:val="24"/>
+        </w:rPr>
+        <w:t>, ABAP</w:t>
+      </w:r>
+      <w:r>
+        <w:rPr>
+          <w:rFonts w:eastAsia="Calibri" w:cstheme="minorHAnsi"/>
+          <w:noProof/>
+          <w:color w:val="000000" w:themeColor="text1"/>
+          <w:kern w:val="24"/>
+        </w:rPr>
+        <w:t>), SAP–MES integration</w:t>
       </w:r>
     </w:p>
     <w:p>
@@ -1304,7 +1441,7 @@
               </wp:anchor>
             </w:drawing>
           </mc:Choice>
-          <mc:Fallback xmlns:oel="http://schemas.microsoft.com/office/2019/extlst" xmlns:w16du="http://schemas.microsoft.com/office/word/2023/wordml/word16du" xmlns:w16sdtfl="http://schemas.microsoft.com/office/word/2024/wordml/sdtformatlock">
+          <mc:Fallback xmlns:w16sdtfl="http://schemas.microsoft.com/office/word/2024/wordml/sdtformatlock" xmlns:w16du="http://schemas.microsoft.com/office/word/2023/wordml/word16du" xmlns:oel="http://schemas.microsoft.com/office/2019/extlst">
             <w:pict>
               <v:shape w14:anchorId="11883FBB" id="_x0000_s1028" type="#_x0000_t202" style="position:absolute;left:0;text-align:left;margin-left:0;margin-top:28.05pt;width:139.7pt;height:44.25pt;z-index:251667456;visibility:visible;mso-wrap-style:square;mso-height-percent:0;mso-wrap-distance-left:9pt;mso-wrap-distance-top:0;mso-wrap-distance-right:9pt;mso-wrap-distance-bottom:0;mso-position-horizontal:absolute;mso-position-horizontal-relative:page;mso-position-vertical:absolute;mso-position-vertical-relative:text;mso-height-percent:0;mso-height-relative:margin;v-text-anchor:middle" o:gfxdata="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" filled="f" stroked="f" strokeweight=".25pt">
                 <v:stroke miterlimit="4"/>
@@ -1524,7 +1661,7 @@
               </wp:anchor>
             </w:drawing>
           </mc:Choice>
-          <mc:Fallback xmlns:oel="http://schemas.microsoft.com/office/2019/extlst" xmlns:w16du="http://schemas.microsoft.com/office/word/2023/wordml/word16du" xmlns:w16sdtfl="http://schemas.microsoft.com/office/word/2024/wordml/sdtformatlock">
+          <mc:Fallback xmlns:w16sdtfl="http://schemas.microsoft.com/office/word/2024/wordml/sdtformatlock" xmlns:w16du="http://schemas.microsoft.com/office/word/2023/wordml/word16du" xmlns:oel="http://schemas.microsoft.com/office/2019/extlst">
             <w:pict>
               <v:line w14:anchorId="69DDB3B8" id="Connecteur droit 103" o:spid="_x0000_s1026" style="position:absolute;z-index:251666432;visibility:visible;mso-wrap-style:square;mso-width-percent:0;mso-height-percent:0;mso-wrap-distance-left:9pt;mso-wrap-distance-top:0;mso-wrap-distance-right:9pt;mso-wrap-distance-bottom:0;mso-position-horizontal:right;mso-position-horizontal-relative:margin;mso-position-vertical:absolute;mso-position-vertical-relative:text;mso-width-percent:0;mso-height-percent:0;mso-width-relative:margin;mso-height-relative:margin" from="338.05pt,6.8pt" to="727.3pt,6.8pt" o:gfxdata="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" strokecolor="#004a77" strokeweight="2.25pt">
                 <v:stroke miterlimit="4" joinstyle="miter"/>
@@ -2318,6 +2455,7 @@
           <w:color w:val="000000" w:themeColor="text1"/>
           <w:kern w:val="24"/>
         </w:rPr>
+        <w:lastRenderedPageBreak/>
         <w:t xml:space="preserve">Created and maintained </w:t>
       </w:r>
       <w:r>
@@ -2413,7 +2551,6 @@
           <w:szCs w:val="36"/>
           <w:lang w:val="en-MY"/>
         </w:rPr>
-        <w:lastRenderedPageBreak/>
         <mc:AlternateContent>
           <mc:Choice Requires="wps">
             <w:drawing>
@@ -3437,7 +3574,7 @@
               </wp:anchor>
             </w:drawing>
           </mc:Choice>
-          <mc:Fallback xmlns:oel="http://schemas.microsoft.com/office/2019/extlst" xmlns:w16du="http://schemas.microsoft.com/office/word/2023/wordml/word16du" xmlns:w16sdtfl="http://schemas.microsoft.com/office/word/2024/wordml/sdtformatlock">
+          <mc:Fallback xmlns:w16sdtfl="http://schemas.microsoft.com/office/word/2024/wordml/sdtformatlock" xmlns:w16du="http://schemas.microsoft.com/office/word/2023/wordml/word16du" xmlns:oel="http://schemas.microsoft.com/office/2019/extlst">
             <w:pict>
               <v:shape w14:anchorId="4AB30922" id="_x0000_s1029" type="#_x0000_t202" style="position:absolute;left:0;text-align:left;margin-left:88.5pt;margin-top:.75pt;width:139.7pt;height:44.25pt;z-index:251673600;visibility:visible;mso-wrap-style:square;mso-height-percent:0;mso-wrap-distance-left:9pt;mso-wrap-distance-top:0;mso-wrap-distance-right:9pt;mso-wrap-distance-bottom:0;mso-position-horizontal:right;mso-position-horizontal-relative:left-margin-area;mso-position-vertical:absolute;mso-position-vertical-relative:text;mso-height-percent:0;mso-height-relative:margin;v-text-anchor:middle" o:gfxdata="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" filled="f" stroked="f" strokeweight=".25pt">
                 <v:stroke miterlimit="4"/>
@@ -3550,7 +3687,7 @@
               </wp:anchor>
             </w:drawing>
           </mc:Choice>
-          <mc:Fallback xmlns:oel="http://schemas.microsoft.com/office/2019/extlst" xmlns:w16du="http://schemas.microsoft.com/office/word/2023/wordml/word16du" xmlns:w16sdtfl="http://schemas.microsoft.com/office/word/2024/wordml/sdtformatlock">
+          <mc:Fallback xmlns:w16sdtfl="http://schemas.microsoft.com/office/word/2024/wordml/sdtformatlock" xmlns:w16du="http://schemas.microsoft.com/office/word/2023/wordml/word16du" xmlns:oel="http://schemas.microsoft.com/office/2019/extlst">
             <w:pict>
               <v:line w14:anchorId="2EF59E94" id="Connecteur droit 103" o:spid="_x0000_s1026" style="position:absolute;flip:y;z-index:251675648;visibility:visible;mso-wrap-style:square;mso-width-percent:0;mso-height-percent:0;mso-wrap-distance-left:9pt;mso-wrap-distance-top:0;mso-wrap-distance-right:9pt;mso-wrap-distance-bottom:0;mso-position-horizontal:right;mso-position-horizontal-relative:margin;mso-position-vertical:absolute;mso-position-vertical-relative:text;mso-width-percent:0;mso-height-percent:0;mso-width-relative:margin;mso-height-relative:margin" from="341.05pt,6.75pt" to="733.3pt,9pt" o:gfxdata="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" strokecolor="#004a77" strokeweight="2.25pt">
                 <v:stroke miterlimit="4" joinstyle="miter"/>
@@ -3913,7 +4050,7 @@
               </wp:anchor>
             </w:drawing>
           </mc:Choice>
-          <mc:Fallback xmlns:oel="http://schemas.microsoft.com/office/2019/extlst" xmlns:w16du="http://schemas.microsoft.com/office/word/2023/wordml/word16du" xmlns:w16sdtfl="http://schemas.microsoft.com/office/word/2024/wordml/sdtformatlock">
+          <mc:Fallback xmlns:w16sdtfl="http://schemas.microsoft.com/office/word/2024/wordml/sdtformatlock" xmlns:w16du="http://schemas.microsoft.com/office/word/2023/wordml/word16du" xmlns:oel="http://schemas.microsoft.com/office/2019/extlst">
             <w:pict>
               <v:shape w14:anchorId="4871004E" id="_x0000_s1030" type="#_x0000_t202" style="position:absolute;left:0;text-align:left;margin-left:88.5pt;margin-top:1.05pt;width:139.7pt;height:44.25pt;z-index:251685888;visibility:visible;mso-wrap-style:square;mso-height-percent:0;mso-wrap-distance-left:9pt;mso-wrap-distance-top:0;mso-wrap-distance-right:9pt;mso-wrap-distance-bottom:0;mso-position-horizontal:right;mso-position-horizontal-relative:left-margin-area;mso-position-vertical:absolute;mso-position-vertical-relative:text;mso-height-percent:0;mso-height-relative:margin;v-text-anchor:middle" o:gfxdata="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" filled="f" stroked="f" strokeweight=".25pt">
                 <v:stroke miterlimit="4"/>
@@ -4026,7 +4163,7 @@
               </wp:anchor>
             </w:drawing>
           </mc:Choice>
-          <mc:Fallback xmlns:oel="http://schemas.microsoft.com/office/2019/extlst" xmlns:w16du="http://schemas.microsoft.com/office/word/2023/wordml/word16du" xmlns:w16sdtfl="http://schemas.microsoft.com/office/word/2024/wordml/sdtformatlock">
+          <mc:Fallback xmlns:w16sdtfl="http://schemas.microsoft.com/office/word/2024/wordml/sdtformatlock" xmlns:w16du="http://schemas.microsoft.com/office/word/2023/wordml/word16du" xmlns:oel="http://schemas.microsoft.com/office/2019/extlst">
             <w:pict>
               <v:line w14:anchorId="51701AEA" id="Connecteur droit 103" o:spid="_x0000_s1026" style="position:absolute;flip:y;z-index:251683840;visibility:visible;mso-wrap-style:square;mso-width-percent:0;mso-height-percent:0;mso-wrap-distance-left:9pt;mso-wrap-distance-top:0;mso-wrap-distance-right:9pt;mso-wrap-distance-bottom:0;mso-position-horizontal:right;mso-position-horizontal-relative:margin;mso-position-vertical:absolute;mso-position-vertical-relative:text;mso-width-percent:0;mso-height-percent:0;mso-width-relative:margin;mso-height-relative:margin" from="341.05pt,3.75pt" to="733.3pt,6pt" o:gfxdata="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" strokecolor="#004a77" strokeweight="2.25pt">
                 <v:stroke miterlimit="4" joinstyle="miter"/>

</xml_diff>

<commit_message>
feat: Add Certifications and Automation
</commit_message>
<xml_diff>
--- a/CV_Patrick_Gonzaga.docx
+++ b/CV_Patrick_Gonzaga.docx
@@ -35,7 +35,7 @@
         <mc:AlternateContent>
           <mc:Choice Requires="wps">
             <w:drawing>
-              <wp:anchor distT="0" distB="0" distL="114300" distR="114300" simplePos="0" relativeHeight="251657212" behindDoc="0" locked="0" layoutInCell="1" allowOverlap="1" wp14:anchorId="3A65E6F8" wp14:editId="3D36A34C">
+              <wp:anchor distT="0" distB="0" distL="114300" distR="114300" simplePos="0" relativeHeight="251657212" behindDoc="0" locked="0" layoutInCell="1" allowOverlap="1" wp14:anchorId="3A65E6F8" wp14:editId="052052F2">
                 <wp:simplePos x="0" y="0"/>
                 <wp:positionH relativeFrom="leftMargin">
                   <wp:align>right</wp:align>
@@ -100,7 +100,7 @@
           </mc:Choice>
           <mc:Fallback>
             <w:pict>
-              <v:rect w14:anchorId="5F2C9333" id="Rectangle 1" o:spid="_x0000_s1026" style="position:absolute;margin-left:173.05pt;margin-top:-50.35pt;width:224.25pt;height:903.75pt;z-index:251657212;visibility:visible;mso-wrap-style:square;mso-height-percent:0;mso-wrap-distance-left:9pt;mso-wrap-distance-top:0;mso-wrap-distance-right:9pt;mso-wrap-distance-bottom:0;mso-position-horizontal:right;mso-position-horizontal-relative:left-margin-area;mso-position-vertical:absolute;mso-position-vertical-relative:text;mso-height-percent:0;mso-height-relative:margin;v-text-anchor:middle" o:gfxdata="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" fillcolor="#0f9ed5 [3207]" stroked="f">
+              <v:rect w14:anchorId="3F1D7F6E" id="Rectangle 1" o:spid="_x0000_s1026" style="position:absolute;margin-left:173.05pt;margin-top:-50.35pt;width:224.25pt;height:903.75pt;z-index:251657212;visibility:visible;mso-wrap-style:square;mso-height-percent:0;mso-wrap-distance-left:9pt;mso-wrap-distance-top:0;mso-wrap-distance-right:9pt;mso-wrap-distance-bottom:0;mso-position-horizontal:right;mso-position-horizontal-relative:left-margin-area;mso-position-vertical:absolute;mso-position-vertical-relative:text;mso-height-percent:0;mso-height-relative:margin;v-text-anchor:middle" o:gfxdata="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" fillcolor="#0f9ed5 [3207]" stroked="f">
                 <v:fill opacity="32896f"/>
                 <w10:wrap anchorx="margin"/>
               </v:rect>
@@ -237,13 +237,13 @@
         <mc:AlternateContent>
           <mc:Choice Requires="wps">
             <w:drawing>
-              <wp:anchor distT="0" distB="0" distL="114300" distR="114300" simplePos="0" relativeHeight="251664384" behindDoc="0" locked="0" layoutInCell="1" allowOverlap="1" wp14:anchorId="0C4F8682" wp14:editId="0A6F00EE">
+              <wp:anchor distT="0" distB="0" distL="114300" distR="114300" simplePos="0" relativeHeight="251664384" behindDoc="0" locked="0" layoutInCell="1" allowOverlap="1" wp14:anchorId="0C4F8682" wp14:editId="0E61DD6B">
                 <wp:simplePos x="0" y="0"/>
                 <wp:positionH relativeFrom="leftMargin">
                   <wp:posOffset>54610</wp:posOffset>
                 </wp:positionH>
                 <wp:positionV relativeFrom="paragraph">
-                  <wp:posOffset>458470</wp:posOffset>
+                  <wp:posOffset>477520</wp:posOffset>
                 </wp:positionV>
                 <wp:extent cx="1774190" cy="495300"/>
                 <wp:effectExtent l="0" t="0" r="0" b="0"/>
@@ -352,13 +352,13 @@
               </wp:anchor>
             </w:drawing>
           </mc:Choice>
-          <mc:Fallback xmlns:w16sdtfl="http://schemas.microsoft.com/office/word/2024/wordml/sdtformatlock" xmlns:w16du="http://schemas.microsoft.com/office/word/2023/wordml/word16du" xmlns:oel="http://schemas.microsoft.com/office/2019/extlst">
+          <mc:Fallback>
             <w:pict>
               <v:shapetype w14:anchorId="0C4F8682" id="_x0000_t202" coordsize="21600,21600" o:spt="202" path="m,l,21600r21600,l21600,xe">
                 <v:stroke joinstyle="miter"/>
                 <v:path gradientshapeok="t" o:connecttype="rect"/>
               </v:shapetype>
-              <v:shape id="ZoneTexte 112" o:spid="_x0000_s1026" type="#_x0000_t202" style="position:absolute;left:0;text-align:left;margin-left:4.3pt;margin-top:36.1pt;width:139.7pt;height:39pt;z-index:251664384;visibility:visible;mso-wrap-style:square;mso-height-percent:0;mso-wrap-distance-left:9pt;mso-wrap-distance-top:0;mso-wrap-distance-right:9pt;mso-wrap-distance-bottom:0;mso-position-horizontal:absolute;mso-position-horizontal-relative:left-margin-area;mso-position-vertical:absolute;mso-position-vertical-relative:text;mso-height-percent:0;mso-height-relative:margin;v-text-anchor:middle" o:gfxdata="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" filled="f" stroked="f" strokeweight=".25pt">
+              <v:shape id="ZoneTexte 112" o:spid="_x0000_s1026" type="#_x0000_t202" style="position:absolute;left:0;text-align:left;margin-left:4.3pt;margin-top:37.6pt;width:139.7pt;height:39pt;z-index:251664384;visibility:visible;mso-wrap-style:square;mso-height-percent:0;mso-wrap-distance-left:9pt;mso-wrap-distance-top:0;mso-wrap-distance-right:9pt;mso-wrap-distance-bottom:0;mso-position-horizontal:absolute;mso-position-horizontal-relative:left-margin-area;mso-position-vertical:absolute;mso-position-vertical-relative:text;mso-height-percent:0;mso-height-relative:margin;v-text-anchor:middle" o:gfxdata="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" filled="f" stroked="f" strokeweight=".25pt">
                 <v:stroke miterlimit="4"/>
                 <v:textbox inset=".84333mm,.84333mm,.84333mm,.84333mm">
                   <w:txbxContent>
@@ -505,15 +505,11 @@
         <w:r>
           <w:rPr>
             <w:rStyle w:val="Hyperlink"/>
-            <w:rFonts w:ascii="Calibri" w:hAnsi="Calibri" w:cs="Calibri"/>
           </w:rPr>
           <w:t>https://patgonzaga.dev</w:t>
         </w:r>
       </w:hyperlink>
       <w:r>
-        <w:rPr>
-          <w:rFonts w:ascii="Calibri" w:hAnsi="Calibri" w:cs="Calibri"/>
-        </w:rPr>
         <w:t xml:space="preserve"> </w:t>
       </w:r>
     </w:p>
@@ -607,7 +603,7 @@
               </wp:anchor>
             </w:drawing>
           </mc:Choice>
-          <mc:Fallback xmlns:w16sdtfl="http://schemas.microsoft.com/office/word/2024/wordml/sdtformatlock" xmlns:w16du="http://schemas.microsoft.com/office/word/2023/wordml/word16du" xmlns:oel="http://schemas.microsoft.com/office/2019/extlst">
+          <mc:Fallback xmlns:oel="http://schemas.microsoft.com/office/2019/extlst" xmlns:w16du="http://schemas.microsoft.com/office/word/2023/wordml/word16du" xmlns:w16sdtfl="http://schemas.microsoft.com/office/word/2024/wordml/sdtformatlock">
             <w:pict>
               <v:line w14:anchorId="5764FF11" id="Connecteur droit 103" o:spid="_x0000_s1026" style="position:absolute;flip:y;z-index:251663360;visibility:visible;mso-wrap-style:square;mso-width-percent:0;mso-height-percent:0;mso-wrap-distance-left:9pt;mso-wrap-distance-top:0;mso-wrap-distance-right:9pt;mso-wrap-distance-bottom:0;mso-position-horizontal:right;mso-position-horizontal-relative:margin;mso-position-vertical:absolute;mso-position-vertical-relative:text;mso-width-percent:0;mso-height-percent:0;mso-width-relative:margin;mso-height-relative:margin" from="341.05pt,2.5pt" to="733.3pt,4.75pt" o:gfxdata="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" strokecolor="#004a77" strokeweight="2.25pt">
                 <v:stroke miterlimit="4" joinstyle="miter"/>
@@ -646,40 +642,29 @@
           <w:sz w:val="22"/>
           <w:szCs w:val="22"/>
         </w:rPr>
-        <w:t xml:space="preserve">Senior </w:t>
-      </w:r>
-      <w:r>
-        <w:rPr>
-          <w:rFonts w:asciiTheme="minorHAnsi" w:eastAsia="Calibri" w:hAnsiTheme="minorHAnsi" w:cstheme="minorHAnsi"/>
-          <w:noProof/>
-          <w:color w:val="000000" w:themeColor="text1"/>
-          <w:kern w:val="24"/>
-          <w:sz w:val="22"/>
-          <w:szCs w:val="22"/>
-        </w:rPr>
-        <w:t xml:space="preserve">Software engineer with 15+ years of experience building systems that support real business operations — spanning backend development, system integrations, and enterprise platforms. Currently focused on .NET and Azure, delivering APIs and distributed systems that are stable and maintainable at scale. Known for stepping into unfamiliar technology and delivering — from learning ABAP </w:t>
-      </w:r>
-      <w:r>
-        <w:rPr>
-          <w:rFonts w:asciiTheme="minorHAnsi" w:eastAsia="Calibri" w:hAnsiTheme="minorHAnsi" w:cstheme="minorHAnsi"/>
-          <w:noProof/>
-          <w:color w:val="000000" w:themeColor="text1"/>
-          <w:kern w:val="24"/>
-          <w:sz w:val="22"/>
-          <w:szCs w:val="22"/>
-        </w:rPr>
-        <w:t>to bridge</w:t>
-      </w:r>
-      <w:r>
-        <w:rPr>
-          <w:rFonts w:asciiTheme="minorHAnsi" w:eastAsia="Calibri" w:hAnsiTheme="minorHAnsi" w:cstheme="minorHAnsi"/>
-          <w:noProof/>
-          <w:color w:val="000000" w:themeColor="text1"/>
-          <w:kern w:val="24"/>
-          <w:sz w:val="22"/>
-          <w:szCs w:val="22"/>
-        </w:rPr>
-        <w:t xml:space="preserve"> SAP-to-MES integrations to picking up Retool to build production admin tooling.</w:t>
+        <w:t xml:space="preserve">Senior Software Engineer with 15+ years of experience in </w:t>
+      </w:r>
+      <w:r>
+        <w:rPr>
+          <w:rFonts w:asciiTheme="minorHAnsi" w:eastAsia="Calibri" w:hAnsiTheme="minorHAnsi" w:cstheme="minorHAnsi"/>
+          <w:noProof/>
+          <w:color w:val="000000" w:themeColor="text1"/>
+          <w:kern w:val="24"/>
+          <w:sz w:val="22"/>
+          <w:szCs w:val="22"/>
+        </w:rPr>
+        <w:t>software</w:t>
+      </w:r>
+      <w:r>
+        <w:rPr>
+          <w:rFonts w:asciiTheme="minorHAnsi" w:eastAsia="Calibri" w:hAnsiTheme="minorHAnsi" w:cstheme="minorHAnsi"/>
+          <w:noProof/>
+          <w:color w:val="000000" w:themeColor="text1"/>
+          <w:kern w:val="24"/>
+          <w:sz w:val="22"/>
+          <w:szCs w:val="22"/>
+        </w:rPr>
+        <w:t xml:space="preserve"> development, enterprise integrations, and automation. From scripts, cron jobs, stored procedures, and custom applications to modern AI agents powered by n8n, Zapier, and LLMs, I've always focused on replacing manual work with scalable automation that delivers real business value.</w:t>
       </w:r>
     </w:p>
     <w:p>
@@ -713,13 +698,13 @@
         <mc:AlternateContent>
           <mc:Choice Requires="wps">
             <w:drawing>
-              <wp:anchor distT="0" distB="0" distL="114300" distR="114300" simplePos="0" relativeHeight="251677696" behindDoc="0" locked="0" layoutInCell="1" allowOverlap="1" wp14:anchorId="61B3AF97" wp14:editId="4EBA9DCE">
+              <wp:anchor distT="0" distB="0" distL="114300" distR="114300" simplePos="0" relativeHeight="251677696" behindDoc="0" locked="0" layoutInCell="1" allowOverlap="1" wp14:anchorId="61B3AF97" wp14:editId="28CB96B1">
                 <wp:simplePos x="0" y="0"/>
                 <wp:positionH relativeFrom="page">
                   <wp:posOffset>0</wp:posOffset>
                 </wp:positionH>
                 <wp:positionV relativeFrom="paragraph">
-                  <wp:posOffset>3810</wp:posOffset>
+                  <wp:posOffset>137160</wp:posOffset>
                 </wp:positionV>
                 <wp:extent cx="1774190" cy="495300"/>
                 <wp:effectExtent l="0" t="0" r="0" b="0"/>
@@ -828,9 +813,9 @@
               </wp:anchor>
             </w:drawing>
           </mc:Choice>
-          <mc:Fallback xmlns:w16sdtfl="http://schemas.microsoft.com/office/word/2024/wordml/sdtformatlock" xmlns:w16du="http://schemas.microsoft.com/office/word/2023/wordml/word16du" xmlns:oel="http://schemas.microsoft.com/office/2019/extlst">
+          <mc:Fallback>
             <w:pict>
-              <v:shape w14:anchorId="61B3AF97" id="_x0000_s1027" type="#_x0000_t202" style="position:absolute;left:0;text-align:left;margin-left:0;margin-top:.3pt;width:139.7pt;height:39pt;z-index:251677696;visibility:visible;mso-wrap-style:square;mso-height-percent:0;mso-wrap-distance-left:9pt;mso-wrap-distance-top:0;mso-wrap-distance-right:9pt;mso-wrap-distance-bottom:0;mso-position-horizontal:absolute;mso-position-horizontal-relative:page;mso-position-vertical:absolute;mso-position-vertical-relative:text;mso-height-percent:0;mso-height-relative:margin;v-text-anchor:middle" o:gfxdata="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" filled="f" stroked="f" strokeweight=".25pt">
+              <v:shape w14:anchorId="61B3AF97" id="_x0000_s1027" type="#_x0000_t202" style="position:absolute;left:0;text-align:left;margin-left:0;margin-top:10.8pt;width:139.7pt;height:39pt;z-index:251677696;visibility:visible;mso-wrap-style:square;mso-height-percent:0;mso-wrap-distance-left:9pt;mso-wrap-distance-top:0;mso-wrap-distance-right:9pt;mso-wrap-distance-bottom:0;mso-position-horizontal:absolute;mso-position-horizontal-relative:page;mso-position-vertical:absolute;mso-position-vertical-relative:text;mso-height-percent:0;mso-height-relative:margin;v-text-anchor:middle" o:gfxdata="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" filled="f" stroked="f" strokeweight=".25pt">
                 <v:stroke miterlimit="4"/>
                 <v:textbox inset=".84333mm,.84333mm,.84333mm,.84333mm">
                   <w:txbxContent>
@@ -987,7 +972,7 @@
               </wp:anchor>
             </w:drawing>
           </mc:Choice>
-          <mc:Fallback xmlns:w16sdtfl="http://schemas.microsoft.com/office/word/2024/wordml/sdtformatlock" xmlns:w16du="http://schemas.microsoft.com/office/word/2023/wordml/word16du" xmlns:oel="http://schemas.microsoft.com/office/2019/extlst">
+          <mc:Fallback xmlns:oel="http://schemas.microsoft.com/office/2019/extlst" xmlns:w16du="http://schemas.microsoft.com/office/word/2023/wordml/word16du" xmlns:w16sdtfl="http://schemas.microsoft.com/office/word/2024/wordml/sdtformatlock">
             <w:pict>
               <v:line w14:anchorId="355D885B" id="Connecteur droit 103" o:spid="_x0000_s1026" style="position:absolute;flip:y;z-index:251679744;visibility:visible;mso-wrap-style:square;mso-width-percent:0;mso-height-percent:0;mso-wrap-distance-left:9pt;mso-wrap-distance-top:0;mso-wrap-distance-right:9pt;mso-wrap-distance-bottom:0;mso-position-horizontal:right;mso-position-horizontal-relative:margin;mso-position-vertical:absolute;mso-position-vertical-relative:text;mso-width-percent:0;mso-height-percent:0;mso-width-relative:margin;mso-height-relative:margin" from="341.05pt,2.25pt" to="733.3pt,4.5pt" o:gfxdata="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" strokecolor="#004a77" strokeweight="2.25pt">
                 <v:stroke miterlimit="4" joinstyle="miter"/>
@@ -1346,6 +1331,94 @@
       </w:pPr>
       <w:r>
         <w:rPr>
+          <w:rFonts w:eastAsia="Calibri" w:cstheme="minorHAnsi"/>
+          <w:b/>
+          <w:bCs/>
+          <w:noProof/>
+          <w:color w:val="000000" w:themeColor="text1"/>
+          <w:kern w:val="24"/>
+        </w:rPr>
+        <w:t>AI-Assisted Dev:</w:t>
+      </w:r>
+      <w:r>
+        <w:rPr>
+          <w:rFonts w:eastAsia="Calibri" w:cstheme="minorHAnsi"/>
+          <w:noProof/>
+          <w:color w:val="000000" w:themeColor="text1"/>
+          <w:kern w:val="24"/>
+        </w:rPr>
+        <w:t xml:space="preserve"> Cursor</w:t>
+      </w:r>
+      <w:r>
+        <w:rPr>
+          <w:rFonts w:eastAsia="Calibri" w:cstheme="minorHAnsi"/>
+          <w:noProof/>
+          <w:color w:val="000000" w:themeColor="text1"/>
+          <w:kern w:val="24"/>
+        </w:rPr>
+        <w:t>.</w:t>
+      </w:r>
+    </w:p>
+    <w:p>
+      <w:pPr>
+        <w:pStyle w:val="ListParagraph"/>
+        <w:numPr>
+          <w:ilvl w:val="0"/>
+          <w:numId w:val="1"/>
+        </w:numPr>
+        <w:spacing w:after="0" w:line="240" w:lineRule="auto"/>
+        <w:jc w:val="both"/>
+        <w:rPr>
+          <w:rFonts w:eastAsia="Calibri" w:cstheme="minorHAnsi"/>
+          <w:noProof/>
+          <w:color w:val="000000" w:themeColor="text1"/>
+          <w:kern w:val="24"/>
+        </w:rPr>
+      </w:pPr>
+      <w:r>
+        <w:rPr>
+          <w:rFonts w:eastAsia="Calibri" w:cstheme="minorHAnsi"/>
+          <w:b/>
+          <w:bCs/>
+          <w:noProof/>
+          <w:color w:val="000000" w:themeColor="text1"/>
+          <w:kern w:val="24"/>
+        </w:rPr>
+        <w:t>Portal &amp; Reporting:</w:t>
+      </w:r>
+      <w:r>
+        <w:rPr>
+          <w:rFonts w:eastAsia="Calibri" w:cstheme="minorHAnsi"/>
+          <w:noProof/>
+          <w:color w:val="000000" w:themeColor="text1"/>
+          <w:kern w:val="24"/>
+        </w:rPr>
+        <w:t xml:space="preserve"> Retool, TIBCO Spotfire</w:t>
+      </w:r>
+      <w:r>
+        <w:rPr>
+          <w:rFonts w:eastAsia="Calibri" w:cstheme="minorHAnsi"/>
+          <w:noProof/>
+          <w:color w:val="000000" w:themeColor="text1"/>
+          <w:kern w:val="24"/>
+        </w:rPr>
+        <w:t>.</w:t>
+      </w:r>
+    </w:p>
+    <w:p>
+      <w:pPr>
+        <w:pStyle w:val="ListParagraph"/>
+        <w:spacing w:after="0" w:line="240" w:lineRule="auto"/>
+        <w:jc w:val="both"/>
+        <w:rPr>
+          <w:rFonts w:eastAsia="Calibri" w:cstheme="minorHAnsi"/>
+          <w:noProof/>
+          <w:color w:val="000000" w:themeColor="text1"/>
+          <w:kern w:val="24"/>
+        </w:rPr>
+      </w:pPr>
+      <w:r>
+        <w:rPr>
           <w:rFonts w:ascii="Helvetica" w:hAnsi="Helvetica"/>
           <w:noProof/>
           <w:color w:val="0068A7"/>
@@ -1355,13 +1428,13 @@
         <mc:AlternateContent>
           <mc:Choice Requires="wps">
             <w:drawing>
-              <wp:anchor distT="0" distB="0" distL="114300" distR="114300" simplePos="0" relativeHeight="251667456" behindDoc="0" locked="0" layoutInCell="1" allowOverlap="1" wp14:anchorId="11883FBB" wp14:editId="567B2EAE">
+              <wp:anchor distT="0" distB="0" distL="114300" distR="114300" simplePos="0" relativeHeight="251667456" behindDoc="0" locked="0" layoutInCell="1" allowOverlap="1" wp14:anchorId="11883FBB" wp14:editId="547D6EBE">
                 <wp:simplePos x="0" y="0"/>
                 <wp:positionH relativeFrom="page">
                   <wp:posOffset>0</wp:posOffset>
                 </wp:positionH>
                 <wp:positionV relativeFrom="paragraph">
-                  <wp:posOffset>356235</wp:posOffset>
+                  <wp:posOffset>215265</wp:posOffset>
                 </wp:positionV>
                 <wp:extent cx="1774190" cy="561975"/>
                 <wp:effectExtent l="0" t="0" r="0" b="9525"/>
@@ -1441,9 +1514,9 @@
               </wp:anchor>
             </w:drawing>
           </mc:Choice>
-          <mc:Fallback xmlns:w16sdtfl="http://schemas.microsoft.com/office/word/2024/wordml/sdtformatlock" xmlns:w16du="http://schemas.microsoft.com/office/word/2023/wordml/word16du" xmlns:oel="http://schemas.microsoft.com/office/2019/extlst">
+          <mc:Fallback>
             <w:pict>
-              <v:shape w14:anchorId="11883FBB" id="_x0000_s1028" type="#_x0000_t202" style="position:absolute;left:0;text-align:left;margin-left:0;margin-top:28.05pt;width:139.7pt;height:44.25pt;z-index:251667456;visibility:visible;mso-wrap-style:square;mso-height-percent:0;mso-wrap-distance-left:9pt;mso-wrap-distance-top:0;mso-wrap-distance-right:9pt;mso-wrap-distance-bottom:0;mso-position-horizontal:absolute;mso-position-horizontal-relative:page;mso-position-vertical:absolute;mso-position-vertical-relative:text;mso-height-percent:0;mso-height-relative:margin;v-text-anchor:middle" o:gfxdata="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" filled="f" stroked="f" strokeweight=".25pt">
+              <v:shape w14:anchorId="11883FBB" id="_x0000_s1028" type="#_x0000_t202" style="position:absolute;left:0;text-align:left;margin-left:0;margin-top:16.95pt;width:139.7pt;height:44.25pt;z-index:251667456;visibility:visible;mso-wrap-style:square;mso-height-percent:0;mso-wrap-distance-left:9pt;mso-wrap-distance-top:0;mso-wrap-distance-right:9pt;mso-wrap-distance-bottom:0;mso-position-horizontal:absolute;mso-position-horizontal-relative:page;mso-position-vertical:absolute;mso-position-vertical-relative:text;mso-height-percent:0;mso-height-relative:margin;v-text-anchor:middle" o:gfxdata="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" filled="f" stroked="f" strokeweight=".25pt">
                 <v:stroke miterlimit="4"/>
                 <v:textbox inset=".84333mm,.84333mm,.84333mm,.84333mm">
                   <w:txbxContent>
@@ -1480,94 +1553,6 @@
           </mc:Fallback>
         </mc:AlternateContent>
       </w:r>
-      <w:r>
-        <w:rPr>
-          <w:rFonts w:eastAsia="Calibri" w:cstheme="minorHAnsi"/>
-          <w:b/>
-          <w:bCs/>
-          <w:noProof/>
-          <w:color w:val="000000" w:themeColor="text1"/>
-          <w:kern w:val="24"/>
-        </w:rPr>
-        <w:t>AI-Assisted Dev:</w:t>
-      </w:r>
-      <w:r>
-        <w:rPr>
-          <w:rFonts w:eastAsia="Calibri" w:cstheme="minorHAnsi"/>
-          <w:noProof/>
-          <w:color w:val="000000" w:themeColor="text1"/>
-          <w:kern w:val="24"/>
-        </w:rPr>
-        <w:t xml:space="preserve"> Cursor</w:t>
-      </w:r>
-      <w:r>
-        <w:rPr>
-          <w:rFonts w:eastAsia="Calibri" w:cstheme="minorHAnsi"/>
-          <w:noProof/>
-          <w:color w:val="000000" w:themeColor="text1"/>
-          <w:kern w:val="24"/>
-        </w:rPr>
-        <w:t>.</w:t>
-      </w:r>
-    </w:p>
-    <w:p>
-      <w:pPr>
-        <w:pStyle w:val="ListParagraph"/>
-        <w:numPr>
-          <w:ilvl w:val="0"/>
-          <w:numId w:val="1"/>
-        </w:numPr>
-        <w:spacing w:after="0" w:line="240" w:lineRule="auto"/>
-        <w:jc w:val="both"/>
-        <w:rPr>
-          <w:rFonts w:eastAsia="Calibri" w:cstheme="minorHAnsi"/>
-          <w:noProof/>
-          <w:color w:val="000000" w:themeColor="text1"/>
-          <w:kern w:val="24"/>
-        </w:rPr>
-      </w:pPr>
-      <w:r>
-        <w:rPr>
-          <w:rFonts w:eastAsia="Calibri" w:cstheme="minorHAnsi"/>
-          <w:b/>
-          <w:bCs/>
-          <w:noProof/>
-          <w:color w:val="000000" w:themeColor="text1"/>
-          <w:kern w:val="24"/>
-        </w:rPr>
-        <w:t>Portal &amp; Reporting:</w:t>
-      </w:r>
-      <w:r>
-        <w:rPr>
-          <w:rFonts w:eastAsia="Calibri" w:cstheme="minorHAnsi"/>
-          <w:noProof/>
-          <w:color w:val="000000" w:themeColor="text1"/>
-          <w:kern w:val="24"/>
-        </w:rPr>
-        <w:t xml:space="preserve"> Retool, TIBCO Spotfire</w:t>
-      </w:r>
-      <w:r>
-        <w:rPr>
-          <w:rFonts w:eastAsia="Calibri" w:cstheme="minorHAnsi"/>
-          <w:noProof/>
-          <w:color w:val="000000" w:themeColor="text1"/>
-          <w:kern w:val="24"/>
-        </w:rPr>
-        <w:t>.</w:t>
-      </w:r>
-    </w:p>
-    <w:p>
-      <w:pPr>
-        <w:pStyle w:val="ListParagraph"/>
-        <w:spacing w:after="0" w:line="240" w:lineRule="auto"/>
-        <w:jc w:val="both"/>
-        <w:rPr>
-          <w:rFonts w:eastAsia="Calibri" w:cstheme="minorHAnsi"/>
-          <w:noProof/>
-          <w:color w:val="000000" w:themeColor="text1"/>
-          <w:kern w:val="24"/>
-        </w:rPr>
-      </w:pPr>
     </w:p>
     <w:p>
       <w:pPr>
@@ -1661,7 +1646,7 @@
               </wp:anchor>
             </w:drawing>
           </mc:Choice>
-          <mc:Fallback xmlns:w16sdtfl="http://schemas.microsoft.com/office/word/2024/wordml/sdtformatlock" xmlns:w16du="http://schemas.microsoft.com/office/word/2023/wordml/word16du" xmlns:oel="http://schemas.microsoft.com/office/2019/extlst">
+          <mc:Fallback xmlns:oel="http://schemas.microsoft.com/office/2019/extlst" xmlns:w16du="http://schemas.microsoft.com/office/word/2023/wordml/word16du" xmlns:w16sdtfl="http://schemas.microsoft.com/office/word/2024/wordml/sdtformatlock">
             <w:pict>
               <v:line w14:anchorId="69DDB3B8" id="Connecteur droit 103" o:spid="_x0000_s1026" style="position:absolute;z-index:251666432;visibility:visible;mso-wrap-style:square;mso-width-percent:0;mso-height-percent:0;mso-wrap-distance-left:9pt;mso-wrap-distance-top:0;mso-wrap-distance-right:9pt;mso-wrap-distance-bottom:0;mso-position-horizontal:right;mso-position-horizontal-relative:margin;mso-position-vertical:absolute;mso-position-vertical-relative:text;mso-width-percent:0;mso-height-percent:0;mso-width-relative:margin;mso-height-relative:margin" from="338.05pt,6.8pt" to="727.3pt,6.8pt" o:gfxdata="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" strokecolor="#004a77" strokeweight="2.25pt">
                 <v:stroke miterlimit="4" joinstyle="miter"/>
@@ -1812,7 +1797,20 @@
           <w:sz w:val="22"/>
           <w:szCs w:val="22"/>
         </w:rPr>
-        <w:t xml:space="preserve">NET Developer </w:t>
+        <w:t>Backend</w:t>
+      </w:r>
+      <w:r>
+        <w:rPr>
+          <w:rFonts w:asciiTheme="minorHAnsi" w:eastAsia="Calibri" w:hAnsiTheme="minorHAnsi" w:cstheme="minorHAnsi"/>
+          <w:b/>
+          <w:bCs/>
+          <w:noProof/>
+          <w:color w:val="000000" w:themeColor="text1"/>
+          <w:kern w:val="24"/>
+          <w:sz w:val="22"/>
+          <w:szCs w:val="22"/>
+        </w:rPr>
+        <w:t xml:space="preserve"> Developer </w:t>
       </w:r>
       <w:r>
         <w:rPr>
@@ -2455,7 +2453,6 @@
           <w:color w:val="000000" w:themeColor="text1"/>
           <w:kern w:val="24"/>
         </w:rPr>
-        <w:lastRenderedPageBreak/>
         <w:t xml:space="preserve">Created and maintained </w:t>
       </w:r>
       <w:r>
@@ -2541,7 +2538,7 @@
       </w:pPr>
       <w:r>
         <w:rPr>
-          <w:rFonts w:ascii="Raleway Light" w:hAnsi="Raleway Light" w:cstheme="minorBidi"/>
+          <w:rFonts w:ascii="Raleway Light" w:hAnsi="Raleway Light"/>
           <w:b/>
           <w:bCs/>
           <w:noProof/>
@@ -2551,16 +2548,17 @@
           <w:szCs w:val="36"/>
           <w:lang w:val="en-MY"/>
         </w:rPr>
+        <w:lastRenderedPageBreak/>
         <mc:AlternateContent>
           <mc:Choice Requires="wps">
             <w:drawing>
-              <wp:anchor distT="0" distB="0" distL="114300" distR="114300" simplePos="0" relativeHeight="251660287" behindDoc="0" locked="0" layoutInCell="1" allowOverlap="1" wp14:anchorId="65F1F382" wp14:editId="3ABD4634">
+              <wp:anchor distT="0" distB="0" distL="114300" distR="114300" simplePos="0" relativeHeight="251660287" behindDoc="0" locked="0" layoutInCell="1" allowOverlap="1" wp14:anchorId="65F1F382" wp14:editId="30EC2F00">
                 <wp:simplePos x="0" y="0"/>
                 <wp:positionH relativeFrom="leftMargin">
                   <wp:align>right</wp:align>
                 </wp:positionH>
                 <wp:positionV relativeFrom="paragraph">
-                  <wp:posOffset>-741045</wp:posOffset>
+                  <wp:posOffset>-656590</wp:posOffset>
                 </wp:positionV>
                 <wp:extent cx="2847975" cy="10772775"/>
                 <wp:effectExtent l="0" t="0" r="9525" b="9525"/>
@@ -2619,7 +2617,7 @@
           </mc:Choice>
           <mc:Fallback>
             <w:pict>
-              <v:rect w14:anchorId="3F4D6D25" id="Rectangle 1" o:spid="_x0000_s1026" style="position:absolute;margin-left:173.05pt;margin-top:-58.35pt;width:224.25pt;height:848.25pt;z-index:251660287;visibility:visible;mso-wrap-style:square;mso-height-percent:0;mso-wrap-distance-left:9pt;mso-wrap-distance-top:0;mso-wrap-distance-right:9pt;mso-wrap-distance-bottom:0;mso-position-horizontal:right;mso-position-horizontal-relative:left-margin-area;mso-position-vertical:absolute;mso-position-vertical-relative:text;mso-height-percent:0;mso-height-relative:margin;v-text-anchor:middle" o:gfxdata="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" fillcolor="#0f9ed5 [3207]" stroked="f">
+              <v:rect w14:anchorId="40007728" id="Rectangle 1" o:spid="_x0000_s1026" style="position:absolute;margin-left:173.05pt;margin-top:-51.7pt;width:224.25pt;height:848.25pt;z-index:251660287;visibility:visible;mso-wrap-style:square;mso-height-percent:0;mso-wrap-distance-left:9pt;mso-wrap-distance-top:0;mso-wrap-distance-right:9pt;mso-wrap-distance-bottom:0;mso-position-horizontal:right;mso-position-horizontal-relative:left-margin-area;mso-position-vertical:absolute;mso-position-vertical-relative:text;mso-height-percent:0;mso-height-relative:margin;v-text-anchor:middle" o:gfxdata="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" fillcolor="#0f9ed5 [3207]" stroked="f">
                 <v:fill opacity="32896f"/>
                 <w10:wrap anchorx="margin"/>
               </v:rect>
@@ -3175,7 +3173,106 @@
           <w:color w:val="000000" w:themeColor="text1"/>
           <w:kern w:val="24"/>
         </w:rPr>
-        <w:t xml:space="preserve"> delivered in-house POS, casino management (CMS), and biometric timekeeping (ATS); fully automated previously manual processes where applicable.</w:t>
+        <w:t xml:space="preserve"> delivered in-house </w:t>
+      </w:r>
+      <w:r>
+        <w:rPr>
+          <w:rFonts w:eastAsia="Calibri" w:cstheme="minorHAnsi"/>
+          <w:noProof/>
+          <w:color w:val="000000" w:themeColor="text1"/>
+          <w:kern w:val="24"/>
+        </w:rPr>
+        <w:t>Point of Sales</w:t>
+      </w:r>
+      <w:r>
+        <w:rPr>
+          <w:rFonts w:eastAsia="Calibri" w:cstheme="minorHAnsi"/>
+          <w:noProof/>
+          <w:color w:val="000000" w:themeColor="text1"/>
+          <w:kern w:val="24"/>
+        </w:rPr>
+        <w:t xml:space="preserve"> (POS)</w:t>
+      </w:r>
+      <w:r>
+        <w:rPr>
+          <w:rFonts w:eastAsia="Calibri" w:cstheme="minorHAnsi"/>
+          <w:noProof/>
+          <w:color w:val="000000" w:themeColor="text1"/>
+          <w:kern w:val="24"/>
+        </w:rPr>
+        <w:t xml:space="preserve">, </w:t>
+      </w:r>
+      <w:r>
+        <w:rPr>
+          <w:rFonts w:eastAsia="Calibri" w:cstheme="minorHAnsi"/>
+          <w:noProof/>
+          <w:color w:val="000000" w:themeColor="text1"/>
+          <w:kern w:val="24"/>
+        </w:rPr>
+        <w:t>C</w:t>
+      </w:r>
+      <w:r>
+        <w:rPr>
+          <w:rFonts w:eastAsia="Calibri" w:cstheme="minorHAnsi"/>
+          <w:noProof/>
+          <w:color w:val="000000" w:themeColor="text1"/>
+          <w:kern w:val="24"/>
+        </w:rPr>
+        <w:t xml:space="preserve">asino </w:t>
+      </w:r>
+      <w:r>
+        <w:rPr>
+          <w:rFonts w:eastAsia="Calibri" w:cstheme="minorHAnsi"/>
+          <w:noProof/>
+          <w:color w:val="000000" w:themeColor="text1"/>
+          <w:kern w:val="24"/>
+        </w:rPr>
+        <w:t>M</w:t>
+      </w:r>
+      <w:r>
+        <w:rPr>
+          <w:rFonts w:eastAsia="Calibri" w:cstheme="minorHAnsi"/>
+          <w:noProof/>
+          <w:color w:val="000000" w:themeColor="text1"/>
+          <w:kern w:val="24"/>
+        </w:rPr>
+        <w:t xml:space="preserve">anagement (CMS), and </w:t>
+      </w:r>
+      <w:r>
+        <w:rPr>
+          <w:rFonts w:eastAsia="Calibri" w:cstheme="minorHAnsi"/>
+          <w:noProof/>
+          <w:color w:val="000000" w:themeColor="text1"/>
+          <w:kern w:val="24"/>
+        </w:rPr>
+        <w:t>Automated Timekeeping System with Biom</w:t>
+      </w:r>
+      <w:r>
+        <w:rPr>
+          <w:rFonts w:eastAsia="Calibri" w:cstheme="minorHAnsi"/>
+          <w:noProof/>
+          <w:color w:val="000000" w:themeColor="text1"/>
+          <w:kern w:val="24"/>
+        </w:rPr>
+        <w:t>e</w:t>
+      </w:r>
+      <w:r>
+        <w:rPr>
+          <w:rFonts w:eastAsia="Calibri" w:cstheme="minorHAnsi"/>
+          <w:noProof/>
+          <w:color w:val="000000" w:themeColor="text1"/>
+          <w:kern w:val="24"/>
+        </w:rPr>
+        <w:t xml:space="preserve">tric </w:t>
+      </w:r>
+      <w:r>
+        <w:rPr>
+          <w:rFonts w:eastAsia="Calibri" w:cstheme="minorHAnsi"/>
+          <w:noProof/>
+          <w:color w:val="000000" w:themeColor="text1"/>
+          <w:kern w:val="24"/>
+        </w:rPr>
+        <w:t>(ATS); fully automated previously manual processes where applicable.</w:t>
       </w:r>
       <w:r>
         <w:rPr>
@@ -3574,9 +3671,9 @@
               </wp:anchor>
             </w:drawing>
           </mc:Choice>
-          <mc:Fallback xmlns:w16sdtfl="http://schemas.microsoft.com/office/word/2024/wordml/sdtformatlock" xmlns:w16du="http://schemas.microsoft.com/office/word/2023/wordml/word16du" xmlns:oel="http://schemas.microsoft.com/office/2019/extlst">
+          <mc:Fallback>
             <w:pict>
-              <v:shape w14:anchorId="4AB30922" id="_x0000_s1029" type="#_x0000_t202" style="position:absolute;left:0;text-align:left;margin-left:88.5pt;margin-top:.75pt;width:139.7pt;height:44.25pt;z-index:251673600;visibility:visible;mso-wrap-style:square;mso-height-percent:0;mso-wrap-distance-left:9pt;mso-wrap-distance-top:0;mso-wrap-distance-right:9pt;mso-wrap-distance-bottom:0;mso-position-horizontal:right;mso-position-horizontal-relative:left-margin-area;mso-position-vertical:absolute;mso-position-vertical-relative:text;mso-height-percent:0;mso-height-relative:margin;v-text-anchor:middle" o:gfxdata="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" filled="f" stroked="f" strokeweight=".25pt">
+              <v:shape w14:anchorId="4AB30922" id="_x0000_s1029" type="#_x0000_t202" style="position:absolute;left:0;text-align:left;margin-left:88.5pt;margin-top:.75pt;width:139.7pt;height:44.25pt;z-index:251673600;visibility:visible;mso-wrap-style:square;mso-height-percent:0;mso-wrap-distance-left:9pt;mso-wrap-distance-top:0;mso-wrap-distance-right:9pt;mso-wrap-distance-bottom:0;mso-position-horizontal:right;mso-position-horizontal-relative:left-margin-area;mso-position-vertical:absolute;mso-position-vertical-relative:text;mso-height-percent:0;mso-height-relative:margin;v-text-anchor:middle" o:gfxdata="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" filled="f" stroked="f" strokeweight=".25pt">
                 <v:stroke miterlimit="4"/>
                 <v:textbox inset=".84333mm,.84333mm,.84333mm,.84333mm">
                   <w:txbxContent>
@@ -3687,7 +3784,7 @@
               </wp:anchor>
             </w:drawing>
           </mc:Choice>
-          <mc:Fallback xmlns:w16sdtfl="http://schemas.microsoft.com/office/word/2024/wordml/sdtformatlock" xmlns:w16du="http://schemas.microsoft.com/office/word/2023/wordml/word16du" xmlns:oel="http://schemas.microsoft.com/office/2019/extlst">
+          <mc:Fallback xmlns:oel="http://schemas.microsoft.com/office/2019/extlst" xmlns:w16du="http://schemas.microsoft.com/office/word/2023/wordml/word16du" xmlns:w16sdtfl="http://schemas.microsoft.com/office/word/2024/wordml/sdtformatlock">
             <w:pict>
               <v:line w14:anchorId="2EF59E94" id="Connecteur droit 103" o:spid="_x0000_s1026" style="position:absolute;flip:y;z-index:251675648;visibility:visible;mso-wrap-style:square;mso-width-percent:0;mso-height-percent:0;mso-wrap-distance-left:9pt;mso-wrap-distance-top:0;mso-wrap-distance-right:9pt;mso-wrap-distance-bottom:0;mso-position-horizontal:right;mso-position-horizontal-relative:margin;mso-position-vertical:absolute;mso-position-vertical-relative:text;mso-width-percent:0;mso-height-percent:0;mso-width-relative:margin;mso-height-relative:margin" from="341.05pt,6.75pt" to="733.3pt,9pt" o:gfxdata="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" strokecolor="#004a77" strokeweight="2.25pt">
                 <v:stroke miterlimit="4" joinstyle="miter"/>
@@ -3718,7 +3815,7 @@
           <w:color w:val="000000" w:themeColor="text1"/>
           <w:kern w:val="24"/>
         </w:rPr>
-        <w:t>N8N Masterclass: Learn Basic AI &amp; Automation using N8N</w:t>
+        <w:t>No Code Automation with Zapier</w:t>
       </w:r>
       <w:r>
         <w:rPr>
@@ -3754,6 +3851,60 @@
           <w:color w:val="000000" w:themeColor="text1"/>
           <w:kern w:val="24"/>
         </w:rPr>
+        <w:t xml:space="preserve">QS101: </w:t>
+      </w:r>
+      <w:r>
+        <w:rPr>
+          <w:rFonts w:eastAsia="Calibri" w:cstheme="minorHAnsi"/>
+          <w:noProof/>
+          <w:color w:val="000000" w:themeColor="text1"/>
+          <w:kern w:val="24"/>
+        </w:rPr>
+        <w:t>N8N</w:t>
+      </w:r>
+      <w:r>
+        <w:rPr>
+          <w:rFonts w:eastAsia="Calibri" w:cstheme="minorHAnsi"/>
+          <w:noProof/>
+          <w:color w:val="000000" w:themeColor="text1"/>
+          <w:kern w:val="24"/>
+        </w:rPr>
+        <w:t xml:space="preserve"> Quickstart</w:t>
+      </w:r>
+      <w:r>
+        <w:rPr>
+          <w:rFonts w:eastAsia="Calibri" w:cstheme="minorHAnsi"/>
+          <w:noProof/>
+          <w:color w:val="000000" w:themeColor="text1"/>
+          <w:kern w:val="24"/>
+        </w:rPr>
+        <w:t xml:space="preserve"> (2026) </w:t>
+      </w:r>
+      <w:r>
+        <w:rPr>
+          <w:rFonts w:eastAsia="Calibri" w:cstheme="minorHAnsi"/>
+          <w:noProof/>
+          <w:color w:val="000000" w:themeColor="text1"/>
+          <w:kern w:val="24"/>
+        </w:rPr>
+        <w:t>•</w:t>
+      </w:r>
+      <w:r>
+        <w:rPr>
+          <w:rFonts w:eastAsia="Calibri" w:cstheme="minorHAnsi"/>
+          <w:noProof/>
+          <w:color w:val="000000" w:themeColor="text1"/>
+          <w:kern w:val="24"/>
+        </w:rPr>
+        <w:t xml:space="preserve"> </w:t>
+      </w:r>
+      <w:r>
+        <w:rPr>
+          <w:rFonts w:eastAsia="Calibri" w:cstheme="minorHAnsi"/>
+          <w:noProof/>
+          <w:color w:val="000000" w:themeColor="text1"/>
+          <w:kern w:val="24"/>
+        </w:rPr>
         <w:t>The Complete ReactJs Course - Basics to Advanced</w:t>
       </w:r>
       <w:r>
@@ -3925,7 +4076,61 @@
           <w:color w:val="000000" w:themeColor="text1"/>
           <w:kern w:val="24"/>
         </w:rPr>
-        <w:t xml:space="preserve"> (2024) • Data Engineering, Data Science &amp; Machine Learning (Project SPARTA, 2022) </w:t>
+        <w:t xml:space="preserve"> (2024) • Data Engineering</w:t>
+      </w:r>
+      <w:r>
+        <w:rPr>
+          <w:rFonts w:eastAsia="Calibri" w:cstheme="minorHAnsi"/>
+          <w:noProof/>
+          <w:color w:val="000000" w:themeColor="text1"/>
+          <w:kern w:val="24"/>
+        </w:rPr>
+        <w:t xml:space="preserve"> Pathway</w:t>
+      </w:r>
+      <w:r>
+        <w:rPr>
+          <w:rFonts w:eastAsia="Calibri" w:cstheme="minorHAnsi"/>
+          <w:noProof/>
+          <w:color w:val="000000" w:themeColor="text1"/>
+          <w:kern w:val="24"/>
+        </w:rPr>
+        <w:t xml:space="preserve"> (</w:t>
+      </w:r>
+      <w:r>
+        <w:rPr>
+          <w:rFonts w:eastAsia="Calibri" w:cstheme="minorHAnsi"/>
+          <w:noProof/>
+          <w:color w:val="000000" w:themeColor="text1"/>
+          <w:kern w:val="24"/>
+        </w:rPr>
+        <w:t>2023</w:t>
+      </w:r>
+      <w:r>
+        <w:rPr>
+          <w:rFonts w:eastAsia="Calibri" w:cstheme="minorHAnsi"/>
+          <w:noProof/>
+          <w:color w:val="000000" w:themeColor="text1"/>
+          <w:kern w:val="24"/>
+        </w:rPr>
+        <w:t xml:space="preserve">) </w:t>
+      </w:r>
+      <w:r>
+        <w:rPr>
+          <w:rFonts w:eastAsia="Calibri" w:cstheme="minorHAnsi"/>
+          <w:noProof/>
+          <w:color w:val="000000" w:themeColor="text1"/>
+          <w:kern w:val="24"/>
+        </w:rPr>
+        <w:t>•</w:t>
+      </w:r>
+      <w:r>
+        <w:rPr>
+          <w:rFonts w:eastAsia="Calibri" w:cstheme="minorHAnsi"/>
+          <w:noProof/>
+          <w:color w:val="000000" w:themeColor="text1"/>
+          <w:kern w:val="24"/>
+        </w:rPr>
+        <w:t xml:space="preserve"> Data Science and Machine Learning Using Python (2022) </w:t>
       </w:r>
     </w:p>
     <w:p>
@@ -4050,9 +4255,9 @@
               </wp:anchor>
             </w:drawing>
           </mc:Choice>
-          <mc:Fallback xmlns:w16sdtfl="http://schemas.microsoft.com/office/word/2024/wordml/sdtformatlock" xmlns:w16du="http://schemas.microsoft.com/office/word/2023/wordml/word16du" xmlns:oel="http://schemas.microsoft.com/office/2019/extlst">
+          <mc:Fallback>
             <w:pict>
-              <v:shape w14:anchorId="4871004E" id="_x0000_s1030" type="#_x0000_t202" style="position:absolute;left:0;text-align:left;margin-left:88.5pt;margin-top:1.05pt;width:139.7pt;height:44.25pt;z-index:251685888;visibility:visible;mso-wrap-style:square;mso-height-percent:0;mso-wrap-distance-left:9pt;mso-wrap-distance-top:0;mso-wrap-distance-right:9pt;mso-wrap-distance-bottom:0;mso-position-horizontal:right;mso-position-horizontal-relative:left-margin-area;mso-position-vertical:absolute;mso-position-vertical-relative:text;mso-height-percent:0;mso-height-relative:margin;v-text-anchor:middle" o:gfxdata="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" filled="f" stroked="f" strokeweight=".25pt">
+              <v:shape w14:anchorId="4871004E" id="_x0000_s1030" type="#_x0000_t202" style="position:absolute;left:0;text-align:left;margin-left:88.5pt;margin-top:1.05pt;width:139.7pt;height:44.25pt;z-index:251685888;visibility:visible;mso-wrap-style:square;mso-height-percent:0;mso-wrap-distance-left:9pt;mso-wrap-distance-top:0;mso-wrap-distance-right:9pt;mso-wrap-distance-bottom:0;mso-position-horizontal:right;mso-position-horizontal-relative:left-margin-area;mso-position-vertical:absolute;mso-position-vertical-relative:text;mso-height-percent:0;mso-height-relative:margin;v-text-anchor:middle" o:gfxdata="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" filled="f" stroked="f" strokeweight=".25pt">
                 <v:stroke miterlimit="4"/>
                 <v:textbox inset=".84333mm,.84333mm,.84333mm,.84333mm">
                   <w:txbxContent>
@@ -4163,7 +4368,7 @@
               </wp:anchor>
             </w:drawing>
           </mc:Choice>
-          <mc:Fallback xmlns:w16sdtfl="http://schemas.microsoft.com/office/word/2024/wordml/sdtformatlock" xmlns:w16du="http://schemas.microsoft.com/office/word/2023/wordml/word16du" xmlns:oel="http://schemas.microsoft.com/office/2019/extlst">
+          <mc:Fallback xmlns:oel="http://schemas.microsoft.com/office/2019/extlst" xmlns:w16du="http://schemas.microsoft.com/office/word/2023/wordml/word16du" xmlns:w16sdtfl="http://schemas.microsoft.com/office/word/2024/wordml/sdtformatlock">
             <w:pict>
               <v:line w14:anchorId="51701AEA" id="Connecteur droit 103" o:spid="_x0000_s1026" style="position:absolute;flip:y;z-index:251683840;visibility:visible;mso-wrap-style:square;mso-width-percent:0;mso-height-percent:0;mso-wrap-distance-left:9pt;mso-wrap-distance-top:0;mso-wrap-distance-right:9pt;mso-wrap-distance-bottom:0;mso-position-horizontal:right;mso-position-horizontal-relative:margin;mso-position-vertical:absolute;mso-position-vertical-relative:text;mso-width-percent:0;mso-height-percent:0;mso-width-relative:margin;mso-height-relative:margin" from="341.05pt,3.75pt" to="733.3pt,6pt" o:gfxdata="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" strokecolor="#004a77" strokeweight="2.25pt">
                 <v:stroke miterlimit="4" joinstyle="miter"/>

</xml_diff>